<commit_message>
Progress 11 Agustus 2026 23:51
</commit_message>
<xml_diff>
--- a/Draft Laporan Tugas Akhir/Draft TA Skripsi - 202210370311094 - M. Heykal Dhafariel Rajendra.docx
+++ b/Draft Laporan Tugas Akhir/Draft TA Skripsi - 202210370311094 - M. Heykal Dhafariel Rajendra.docx
@@ -11069,8 +11069,6 @@
         </w:rPr>
         <w:br w:type="page"/>
       </w:r>
-      <w:bookmarkStart w:id="12" w:name="_GoBack"/>
-      <w:bookmarkEnd w:id="12"/>
     </w:p>
     <w:p>
       <w:pPr>
@@ -11094,7 +11092,7 @@
       <w:pPr>
         <w:pStyle w:val="Heading1"/>
       </w:pPr>
-      <w:bookmarkStart w:id="13" w:name="_Toc236773763"/>
+      <w:bookmarkStart w:id="12" w:name="_Toc236773763"/>
       <w:r>
         <w:lastRenderedPageBreak/>
         <w:t xml:space="preserve">BAB </w:t>
@@ -11105,7 +11103,7 @@
       <w:r>
         <w:t xml:space="preserve"> PENDAHULUAN</w:t>
       </w:r>
-      <w:bookmarkEnd w:id="13"/>
+      <w:bookmarkEnd w:id="12"/>
     </w:p>
     <w:p>
       <w:pPr>
@@ -11116,11 +11114,11 @@
         </w:numPr>
         <w:spacing w:before="240" w:line="360" w:lineRule="auto"/>
       </w:pPr>
-      <w:bookmarkStart w:id="14" w:name="_Toc236773764"/>
+      <w:bookmarkStart w:id="13" w:name="_Toc236773764"/>
       <w:r>
         <w:t>Latar Belakang</w:t>
       </w:r>
-      <w:bookmarkEnd w:id="14"/>
+      <w:bookmarkEnd w:id="13"/>
     </w:p>
     <w:p>
       <w:pPr>
@@ -11387,12 +11385,12 @@
         <w:spacing w:line="360" w:lineRule="auto"/>
         <w:ind w:left="567" w:hanging="283"/>
       </w:pPr>
-      <w:bookmarkStart w:id="15" w:name="_Toc236773765"/>
+      <w:bookmarkStart w:id="14" w:name="_Toc236773765"/>
       <w:r>
         <w:lastRenderedPageBreak/>
         <w:t>Rumusan Masalah</w:t>
       </w:r>
-      <w:bookmarkEnd w:id="15"/>
+      <w:bookmarkEnd w:id="14"/>
     </w:p>
     <w:p>
       <w:pPr>
@@ -11476,11 +11474,11 @@
         <w:spacing w:line="360" w:lineRule="auto"/>
         <w:ind w:left="567" w:hanging="283"/>
       </w:pPr>
-      <w:bookmarkStart w:id="16" w:name="_Toc236773766"/>
+      <w:bookmarkStart w:id="15" w:name="_Toc236773766"/>
       <w:r>
         <w:t>Tujuan Penelitian</w:t>
       </w:r>
-      <w:bookmarkEnd w:id="16"/>
+      <w:bookmarkEnd w:id="15"/>
     </w:p>
     <w:p>
       <w:pPr>
@@ -11558,11 +11556,11 @@
         <w:spacing w:line="360" w:lineRule="auto"/>
         <w:ind w:left="567" w:hanging="283"/>
       </w:pPr>
-      <w:bookmarkStart w:id="17" w:name="_Toc236773767"/>
+      <w:bookmarkStart w:id="16" w:name="_Toc236773767"/>
       <w:r>
         <w:t>Batasan Penelitian</w:t>
       </w:r>
-      <w:bookmarkEnd w:id="17"/>
+      <w:bookmarkEnd w:id="16"/>
     </w:p>
     <w:p>
       <w:pPr>
@@ -11757,12 +11755,12 @@
       <w:pPr>
         <w:pStyle w:val="Heading1"/>
       </w:pPr>
-      <w:bookmarkStart w:id="18" w:name="_Toc236773768"/>
+      <w:bookmarkStart w:id="17" w:name="_Toc236773768"/>
       <w:r>
         <w:lastRenderedPageBreak/>
         <w:t>BAB II TINJAUAN PUSTAKA</w:t>
       </w:r>
-      <w:bookmarkEnd w:id="18"/>
+      <w:bookmarkEnd w:id="17"/>
     </w:p>
     <w:p>
       <w:pPr>
@@ -11777,14 +11775,14 @@
           <w:lang w:val="en-US"/>
         </w:rPr>
       </w:pPr>
-      <w:bookmarkStart w:id="19" w:name="_Toc236773769"/>
+      <w:bookmarkStart w:id="18" w:name="_Toc236773769"/>
       <w:r>
         <w:rPr>
           <w:lang w:val="en-US"/>
         </w:rPr>
         <w:t>Tinjauan Pustaka</w:t>
       </w:r>
-      <w:bookmarkEnd w:id="19"/>
+      <w:bookmarkEnd w:id="18"/>
     </w:p>
     <w:p>
       <w:pPr>
@@ -11865,7 +11863,7 @@
           <w:szCs w:val="24"/>
         </w:rPr>
       </w:pPr>
-      <w:bookmarkStart w:id="20" w:name="_Toc236356611"/>
+      <w:bookmarkStart w:id="19" w:name="_Toc236356611"/>
       <w:r>
         <w:rPr>
           <w:b/>
@@ -11937,7 +11935,7 @@
         </w:rPr>
         <w:t xml:space="preserve"> Tinjauan Penelitian Terdahulu</w:t>
       </w:r>
-      <w:bookmarkEnd w:id="20"/>
+      <w:bookmarkEnd w:id="19"/>
     </w:p>
     <w:tbl>
       <w:tblPr>
@@ -13235,14 +13233,14 @@
           <w:lang w:val="en-US"/>
         </w:rPr>
       </w:pPr>
-      <w:bookmarkStart w:id="21" w:name="_Toc236773770"/>
+      <w:bookmarkStart w:id="20" w:name="_Toc236773770"/>
       <w:r>
         <w:rPr>
           <w:lang w:val="en-US"/>
         </w:rPr>
         <w:t>Landasan Teori</w:t>
       </w:r>
-      <w:bookmarkEnd w:id="21"/>
+      <w:bookmarkEnd w:id="20"/>
     </w:p>
     <w:p>
       <w:pPr>
@@ -13254,11 +13252,11 @@
         <w:spacing w:line="360" w:lineRule="auto"/>
         <w:ind w:left="567" w:hanging="567"/>
       </w:pPr>
-      <w:bookmarkStart w:id="22" w:name="_Toc236773771"/>
+      <w:bookmarkStart w:id="21" w:name="_Toc236773771"/>
       <w:r>
         <w:t>Manajemen Stok dan Pengadaan Material</w:t>
       </w:r>
-      <w:bookmarkEnd w:id="22"/>
+      <w:bookmarkEnd w:id="21"/>
     </w:p>
     <w:p>
       <w:pPr>
@@ -13288,14 +13286,14 @@
         <w:spacing w:line="360" w:lineRule="auto"/>
         <w:ind w:left="567" w:hanging="567"/>
       </w:pPr>
-      <w:bookmarkStart w:id="23" w:name="_Toc236773772"/>
+      <w:bookmarkStart w:id="22" w:name="_Toc236773772"/>
       <w:r>
         <w:t>Business Process Model and Notation</w:t>
       </w:r>
       <w:r>
         <w:t xml:space="preserve"> (BPMN)</w:t>
       </w:r>
-      <w:bookmarkEnd w:id="23"/>
+      <w:bookmarkEnd w:id="22"/>
     </w:p>
     <w:p>
       <w:pPr>
@@ -13419,7 +13417,7 @@
           <w:szCs w:val="24"/>
         </w:rPr>
       </w:pPr>
-      <w:bookmarkStart w:id="24" w:name="_Toc236356536"/>
+      <w:bookmarkStart w:id="23" w:name="_Toc236356536"/>
       <w:r>
         <w:rPr>
           <w:b/>
@@ -13519,7 +13517,7 @@
         </w:rPr>
         <w:t>As-Is</w:t>
       </w:r>
-      <w:bookmarkEnd w:id="24"/>
+      <w:bookmarkEnd w:id="23"/>
       <w:r>
         <w:rPr>
           <w:b/>
@@ -13649,7 +13647,7 @@
         <w:spacing w:line="360" w:lineRule="auto"/>
         <w:ind w:left="567" w:hanging="567"/>
       </w:pPr>
-      <w:bookmarkStart w:id="25" w:name="_Toc236773773"/>
+      <w:bookmarkStart w:id="24" w:name="_Toc236773773"/>
       <w:r>
         <w:lastRenderedPageBreak/>
         <w:t xml:space="preserve">Metode </w:t>
@@ -13660,7 +13658,7 @@
         </w:rPr>
         <w:t>Personal Extreme Programming (PXP)</w:t>
       </w:r>
-      <w:bookmarkEnd w:id="25"/>
+      <w:bookmarkEnd w:id="24"/>
     </w:p>
     <w:p>
       <w:pPr>
@@ -14064,7 +14062,7 @@
           <w:i/>
         </w:rPr>
       </w:pPr>
-      <w:bookmarkStart w:id="26" w:name="_Toc236773774"/>
+      <w:bookmarkStart w:id="25" w:name="_Toc236773774"/>
       <w:r>
         <w:rPr>
           <w:i/>
@@ -14072,7 +14070,7 @@
         <w:lastRenderedPageBreak/>
         <w:t>Unified Modeling Language (UML)</w:t>
       </w:r>
-      <w:bookmarkEnd w:id="26"/>
+      <w:bookmarkEnd w:id="25"/>
     </w:p>
     <w:p>
       <w:pPr>
@@ -14178,7 +14176,7 @@
           <w:i/>
         </w:rPr>
       </w:pPr>
-      <w:bookmarkStart w:id="27" w:name="_Toc236773775"/>
+      <w:bookmarkStart w:id="26" w:name="_Toc236773775"/>
       <w:r>
         <w:t xml:space="preserve">Pengujian Kuantitatif dan </w:t>
       </w:r>
@@ -14188,7 +14186,7 @@
         </w:rPr>
         <w:t>User Acceptance Test (UAT)</w:t>
       </w:r>
-      <w:bookmarkEnd w:id="27"/>
+      <w:bookmarkEnd w:id="26"/>
     </w:p>
     <w:p>
       <w:pPr>
@@ -14361,7 +14359,7 @@
                 <w:iCs/>
               </w:rPr>
             </w:pPr>
-            <w:bookmarkStart w:id="28" w:name="_Toc236261898"/>
+            <w:bookmarkStart w:id="27" w:name="_Toc236261898"/>
             <w:r>
               <w:rPr>
                 <w:b/>
@@ -14410,7 +14408,7 @@
               </w:rPr>
               <w:t>)</w:t>
             </w:r>
-            <w:bookmarkEnd w:id="28"/>
+            <w:bookmarkEnd w:id="27"/>
           </w:p>
         </w:tc>
       </w:tr>
@@ -14498,12 +14496,12 @@
       <w:pPr>
         <w:pStyle w:val="Heading1"/>
       </w:pPr>
-      <w:bookmarkStart w:id="29" w:name="_Toc236773776"/>
+      <w:bookmarkStart w:id="28" w:name="_Toc236773776"/>
       <w:r>
         <w:lastRenderedPageBreak/>
         <w:t>BAB III METODOLOGI PENELITIAN</w:t>
       </w:r>
-      <w:bookmarkEnd w:id="29"/>
+      <w:bookmarkEnd w:id="28"/>
     </w:p>
     <w:p>
       <w:pPr>
@@ -14527,7 +14525,7 @@
           <w:szCs w:val="24"/>
         </w:rPr>
       </w:pPr>
-      <w:bookmarkStart w:id="30" w:name="_Toc236358137"/>
+      <w:bookmarkStart w:id="29" w:name="_Toc236358137"/>
       <w:r>
         <w:rPr>
           <w:b/>
@@ -14619,7 +14617,7 @@
         </w:rPr>
         <w:t xml:space="preserve"> Penelitian</w:t>
       </w:r>
-      <w:bookmarkEnd w:id="30"/>
+      <w:bookmarkEnd w:id="29"/>
     </w:p>
     <w:p>
       <w:pPr>
@@ -14634,14 +14632,14 @@
           <w:lang w:val="en-US"/>
         </w:rPr>
       </w:pPr>
-      <w:bookmarkStart w:id="31" w:name="_Toc236773777"/>
+      <w:bookmarkStart w:id="30" w:name="_Toc236773777"/>
       <w:r>
         <w:rPr>
           <w:lang w:val="en-US"/>
         </w:rPr>
         <w:t>Identifikasi Masalah</w:t>
       </w:r>
-      <w:bookmarkEnd w:id="31"/>
+      <w:bookmarkEnd w:id="30"/>
     </w:p>
     <w:p>
       <w:pPr>
@@ -14886,14 +14884,14 @@
           <w:lang w:val="en-US"/>
         </w:rPr>
       </w:pPr>
-      <w:bookmarkStart w:id="32" w:name="_Toc236773778"/>
+      <w:bookmarkStart w:id="31" w:name="_Toc236773778"/>
       <w:r>
         <w:rPr>
           <w:lang w:val="en-US"/>
         </w:rPr>
         <w:t>Metode Pengumpulan Data</w:t>
       </w:r>
-      <w:bookmarkEnd w:id="32"/>
+      <w:bookmarkEnd w:id="31"/>
     </w:p>
     <w:p>
       <w:pPr>
@@ -15135,7 +15133,7 @@
           <w:lang w:val="en-US"/>
         </w:rPr>
       </w:pPr>
-      <w:bookmarkStart w:id="33" w:name="_Toc236773779"/>
+      <w:bookmarkStart w:id="32" w:name="_Toc236773779"/>
       <w:r>
         <w:rPr>
           <w:lang w:val="en-US"/>
@@ -15149,7 +15147,7 @@
         </w:rPr>
         <w:t>Kebutuhan Sistem</w:t>
       </w:r>
-      <w:bookmarkEnd w:id="33"/>
+      <w:bookmarkEnd w:id="32"/>
     </w:p>
     <w:p>
       <w:pPr>
@@ -15324,7 +15322,7 @@
           <w:szCs w:val="24"/>
         </w:rPr>
       </w:pPr>
-      <w:bookmarkStart w:id="34" w:name="_Toc236608700"/>
+      <w:bookmarkStart w:id="33" w:name="_Toc236608700"/>
       <w:r>
         <w:rPr>
           <w:b/>
@@ -15396,7 +15394,7 @@
         </w:rPr>
         <w:t xml:space="preserve"> Aspek Proses Observasi</w:t>
       </w:r>
-      <w:bookmarkEnd w:id="34"/>
+      <w:bookmarkEnd w:id="33"/>
     </w:p>
     <w:tbl>
       <w:tblPr>
@@ -17117,14 +17115,14 @@
           <w:lang w:val="en-US"/>
         </w:rPr>
       </w:pPr>
-      <w:bookmarkStart w:id="35" w:name="_Toc236773780"/>
+      <w:bookmarkStart w:id="34" w:name="_Toc236773780"/>
       <w:r>
         <w:rPr>
           <w:lang w:val="en-US"/>
         </w:rPr>
         <w:t>Metode Pengembangan Sistem</w:t>
       </w:r>
-      <w:bookmarkEnd w:id="35"/>
+      <w:bookmarkEnd w:id="34"/>
     </w:p>
     <w:p>
       <w:pPr>
@@ -17198,7 +17196,7 @@
           <w:szCs w:val="24"/>
         </w:rPr>
       </w:pPr>
-      <w:bookmarkStart w:id="36" w:name="_Toc236358138"/>
+      <w:bookmarkStart w:id="35" w:name="_Toc236358138"/>
       <w:r>
         <w:rPr>
           <w:b/>
@@ -17279,7 +17277,7 @@
         </w:rPr>
         <w:t>PXP</w:t>
       </w:r>
-      <w:bookmarkEnd w:id="36"/>
+      <w:bookmarkEnd w:id="35"/>
     </w:p>
     <w:p>
       <w:pPr>
@@ -17355,7 +17353,7 @@
         <w:spacing w:line="360" w:lineRule="auto"/>
         <w:ind w:left="567" w:hanging="567"/>
       </w:pPr>
-      <w:bookmarkStart w:id="37" w:name="_Toc236773781"/>
+      <w:bookmarkStart w:id="36" w:name="_Toc236773781"/>
       <w:r>
         <w:rPr>
           <w:i/>
@@ -17365,7 +17363,7 @@
       <w:r>
         <w:t>s</w:t>
       </w:r>
-      <w:bookmarkEnd w:id="37"/>
+      <w:bookmarkEnd w:id="36"/>
     </w:p>
     <w:p>
       <w:pPr>
@@ -17471,14 +17469,14 @@
           <w:i/>
         </w:rPr>
       </w:pPr>
-      <w:bookmarkStart w:id="38" w:name="_Toc236773782"/>
+      <w:bookmarkStart w:id="37" w:name="_Toc236773782"/>
       <w:r>
         <w:rPr>
           <w:i/>
         </w:rPr>
         <w:t>Planning</w:t>
       </w:r>
-      <w:bookmarkEnd w:id="38"/>
+      <w:bookmarkEnd w:id="37"/>
     </w:p>
     <w:p>
       <w:pPr>
@@ -17680,14 +17678,14 @@
           <w:i/>
         </w:rPr>
       </w:pPr>
-      <w:bookmarkStart w:id="39" w:name="_Toc236773783"/>
+      <w:bookmarkStart w:id="38" w:name="_Toc236773783"/>
       <w:r>
         <w:rPr>
           <w:i/>
         </w:rPr>
         <w:t>Iteration Initialization</w:t>
       </w:r>
-      <w:bookmarkEnd w:id="39"/>
+      <w:bookmarkEnd w:id="38"/>
     </w:p>
     <w:p>
       <w:pPr>
@@ -17950,14 +17948,14 @@
           <w:i/>
         </w:rPr>
       </w:pPr>
-      <w:bookmarkStart w:id="40" w:name="_Toc236773784"/>
+      <w:bookmarkStart w:id="39" w:name="_Toc236773784"/>
       <w:r>
         <w:rPr>
           <w:i/>
         </w:rPr>
         <w:t>Design</w:t>
       </w:r>
-      <w:bookmarkEnd w:id="40"/>
+      <w:bookmarkEnd w:id="39"/>
     </w:p>
     <w:p>
       <w:pPr>
@@ -18044,14 +18042,14 @@
           <w:i/>
         </w:rPr>
       </w:pPr>
-      <w:bookmarkStart w:id="41" w:name="_Toc236773785"/>
+      <w:bookmarkStart w:id="40" w:name="_Toc236773785"/>
       <w:r>
         <w:rPr>
           <w:i/>
         </w:rPr>
         <w:t>Implementation</w:t>
       </w:r>
-      <w:bookmarkEnd w:id="41"/>
+      <w:bookmarkEnd w:id="40"/>
     </w:p>
     <w:p>
       <w:pPr>
@@ -18164,14 +18162,14 @@
           <w:i/>
         </w:rPr>
       </w:pPr>
-      <w:bookmarkStart w:id="42" w:name="_Toc236773786"/>
+      <w:bookmarkStart w:id="41" w:name="_Toc236773786"/>
       <w:r>
         <w:rPr>
           <w:i/>
         </w:rPr>
         <w:t>System Testing</w:t>
       </w:r>
-      <w:bookmarkEnd w:id="42"/>
+      <w:bookmarkEnd w:id="41"/>
     </w:p>
     <w:p>
       <w:pPr>
@@ -18361,7 +18359,7 @@
           <w:szCs w:val="24"/>
         </w:rPr>
       </w:pPr>
-      <w:bookmarkStart w:id="43" w:name="_Toc236608701"/>
+      <w:bookmarkStart w:id="42" w:name="_Toc236608701"/>
       <w:r>
         <w:rPr>
           <w:b/>
@@ -18442,7 +18440,7 @@
         </w:rPr>
         <w:t>Usability Testing</w:t>
       </w:r>
-      <w:bookmarkEnd w:id="43"/>
+      <w:bookmarkEnd w:id="42"/>
     </w:p>
     <w:tbl>
       <w:tblPr>
@@ -18985,7 +18983,7 @@
           <w:szCs w:val="24"/>
         </w:rPr>
       </w:pPr>
-      <w:bookmarkStart w:id="44" w:name="_Toc236608702"/>
+      <w:bookmarkStart w:id="43" w:name="_Toc236608702"/>
       <w:r>
         <w:rPr>
           <w:b/>
@@ -19057,7 +19055,7 @@
         </w:rPr>
         <w:t xml:space="preserve"> Skala Penilaian Kuisioner</w:t>
       </w:r>
-      <w:bookmarkEnd w:id="44"/>
+      <w:bookmarkEnd w:id="43"/>
     </w:p>
     <w:tbl>
       <w:tblPr>
@@ -19295,7 +19293,7 @@
           <w:szCs w:val="24"/>
         </w:rPr>
       </w:pPr>
-      <w:bookmarkStart w:id="45" w:name="_Toc236608703"/>
+      <w:bookmarkStart w:id="44" w:name="_Toc236608703"/>
       <w:r>
         <w:rPr>
           <w:b/>
@@ -19376,7 +19374,7 @@
         </w:rPr>
         <w:t>User Acceptance Test (UAT)</w:t>
       </w:r>
-      <w:bookmarkEnd w:id="45"/>
+      <w:bookmarkEnd w:id="44"/>
     </w:p>
     <w:tbl>
       <w:tblPr>
@@ -19627,6 +19625,8 @@
               <w:spacing w:line="360" w:lineRule="auto"/>
               <w:jc w:val="center"/>
             </w:pPr>
+            <w:bookmarkStart w:id="45" w:name="_GoBack"/>
+            <w:bookmarkEnd w:id="45"/>
             <w:r>
               <w:t>P6</w:t>
             </w:r>
@@ -33986,7 +33986,13 @@
         <w:t>prototype</w:t>
       </w:r>
       <w:r>
-        <w:t xml:space="preserve"> disajikan pada Gambar 4.5 sampai dengan Gambar 4.13.</w:t>
+        <w:t xml:space="preserve"> disajikan pada Gambar 4.5 sampai dengan Gambar 4.1</w:t>
+      </w:r>
+      <w:r>
+        <w:t>5</w:t>
+      </w:r>
+      <w:r>
+        <w:t>.</w:t>
       </w:r>
     </w:p>
     <w:p>
@@ -34000,10 +34006,10 @@
           <w:noProof/>
         </w:rPr>
         <w:drawing>
-          <wp:inline distT="0" distB="0" distL="0" distR="0" wp14:anchorId="12E2F2D2" wp14:editId="361FB911">
-            <wp:extent cx="5038725" cy="3352800"/>
-            <wp:effectExtent l="0" t="0" r="9525" b="0"/>
-            <wp:docPr id="3" name="Picture 3" descr="C:\Users\user\Downloads\Login Page.png"/>
+          <wp:inline distT="0" distB="0" distL="0" distR="0" wp14:anchorId="1F4C14A3" wp14:editId="7C27397D">
+            <wp:extent cx="5029200" cy="3352800"/>
+            <wp:effectExtent l="0" t="0" r="0" b="0"/>
+            <wp:docPr id="5" name="Picture 5"/>
             <wp:cNvGraphicFramePr>
               <a:graphicFrameLocks xmlns:a="http://schemas.openxmlformats.org/drawingml/2006/main" noChangeAspect="1"/>
             </wp:cNvGraphicFramePr>
@@ -34011,7 +34017,7 @@
               <a:graphicData uri="http://schemas.openxmlformats.org/drawingml/2006/picture">
                 <pic:pic xmlns:pic="http://schemas.openxmlformats.org/drawingml/2006/picture">
                   <pic:nvPicPr>
-                    <pic:cNvPr id="0" name="Picture 1" descr="C:\Users\user\Downloads\Login Page.png"/>
+                    <pic:cNvPr id="0" name="Picture 1"/>
                     <pic:cNvPicPr>
                       <a:picLocks noChangeAspect="1" noChangeArrowheads="1"/>
                     </pic:cNvPicPr>
@@ -34032,7 +34038,7 @@
                   <pic:spPr bwMode="auto">
                     <a:xfrm>
                       <a:off x="0" y="0"/>
-                      <a:ext cx="5038725" cy="3352800"/>
+                      <a:ext cx="5029200" cy="3352800"/>
                     </a:xfrm>
                     <a:prstGeom prst="rect">
                       <a:avLst/>
@@ -34146,24 +34152,10 @@
     <w:p>
       <w:pPr>
         <w:spacing w:line="360" w:lineRule="auto"/>
-      </w:pPr>
-    </w:p>
-    <w:p>
-      <w:pPr>
-        <w:spacing w:line="360" w:lineRule="auto"/>
         <w:ind w:firstLine="567"/>
       </w:pPr>
       <w:r>
-        <w:t xml:space="preserve">Halaman </w:t>
-      </w:r>
-      <w:r>
-        <w:rPr>
-          <w:i/>
-        </w:rPr>
-        <w:t>Login</w:t>
-      </w:r>
-      <w:r>
-        <w:t xml:space="preserve"> pada Gambar 4.5 berfungsi sebagai halaman autentikasi yang digunakan untuk memverifikasi identitas pengguna sebelum mengakses sistem pengecekan stok dan pengadaan material. Halaman ini merupakan gerbang awal bagi seluruh pengguna agar hanya pihak yang memiliki hak akses yang dapat menggunakan fitur-fitur yang tersedia pada sistem.</w:t>
+        <w:t>Halaman login pada Gambar 4.5 dirancang sebagai prototype antarmuka awal untuk memberikan akses kepada pengguna sebelum menggunakan sistem pengecekan stok material King Aluminium Malang. Prototype ini terdiri dari logo dan identitas sistem, kolom username, kolom password, serta tombol Login sebagai elemen utama untuk proses autentikasi pengguna.</w:t>
       </w:r>
     </w:p>
     <w:p>
@@ -34172,43 +34164,16 @@
         <w:ind w:firstLine="567"/>
       </w:pPr>
       <w:r>
-        <w:t xml:space="preserve">Pada halaman </w:t>
-      </w:r>
-      <w:r>
-        <w:rPr>
-          <w:i/>
-        </w:rPr>
-        <w:t>login</w:t>
-      </w:r>
-      <w:r>
-        <w:t xml:space="preserve"> terdapat dua kolom input, yaitu </w:t>
-      </w:r>
-      <w:r>
-        <w:rPr>
-          <w:i/>
-        </w:rPr>
-        <w:t xml:space="preserve">Username </w:t>
-      </w:r>
-      <w:r>
-        <w:t xml:space="preserve">dan </w:t>
-      </w:r>
-      <w:r>
-        <w:rPr>
-          <w:i/>
-        </w:rPr>
-        <w:t>Password</w:t>
-      </w:r>
-      <w:r>
-        <w:t xml:space="preserve">, yang harus diisi oleh pengguna sesuai dengan akun yang telah terdaftar. Setelah data autentikasi dimasukkan, pengguna dapat menekan tombol </w:t>
-      </w:r>
-      <w:r>
-        <w:rPr>
-          <w:i/>
-        </w:rPr>
-        <w:t>Login</w:t>
-      </w:r>
-      <w:r>
-        <w:t xml:space="preserve"> untuk melakukan proses verifikasi identitas.</w:t>
+        <w:t>Perancangan menggunakan tampilan yang sederhana dan terstruktur agar pengguna dapat memahami fungsi halaman dengan mudah. Kolom username dan password dilengkapi ikon serta placeholder sebagai petunjuk pengisian data. Tombol Login menggunakan warna biru sebagai penanda aksi utama.</w:t>
+      </w:r>
+    </w:p>
+    <w:p>
+      <w:pPr>
+        <w:spacing w:line="360" w:lineRule="auto"/>
+        <w:ind w:firstLine="567"/>
+      </w:pPr>
+      <w:r>
+        <w:t>Prototype ini hanya mencakup perancangan antarmuka dan alur interaksi halaman login pada tahap desain, sehingga belum membahas implementasi website, database, maupun mekanisme autentikasi secara nyata.</w:t>
       </w:r>
     </w:p>
     <w:p>
@@ -34223,10 +34188,10 @@
         </w:rPr>
         <w:lastRenderedPageBreak/>
         <w:drawing>
-          <wp:inline distT="0" distB="0" distL="0" distR="0" wp14:anchorId="5FB539AE" wp14:editId="7FBD6EDA">
-            <wp:extent cx="5038725" cy="3171825"/>
-            <wp:effectExtent l="0" t="0" r="9525" b="9525"/>
-            <wp:docPr id="21" name="Picture 21" descr="C:\Users\user\Downloads\Dashboard Page.png"/>
+          <wp:inline distT="0" distB="0" distL="0" distR="0" wp14:anchorId="4A6DA841" wp14:editId="5F279707">
+            <wp:extent cx="5041900" cy="3175000"/>
+            <wp:effectExtent l="0" t="0" r="6350" b="6350"/>
+            <wp:docPr id="7" name="Picture 7"/>
             <wp:cNvGraphicFramePr>
               <a:graphicFrameLocks xmlns:a="http://schemas.openxmlformats.org/drawingml/2006/main" noChangeAspect="1"/>
             </wp:cNvGraphicFramePr>
@@ -34234,7 +34199,7 @@
               <a:graphicData uri="http://schemas.openxmlformats.org/drawingml/2006/picture">
                 <pic:pic xmlns:pic="http://schemas.openxmlformats.org/drawingml/2006/picture">
                   <pic:nvPicPr>
-                    <pic:cNvPr id="0" name="Picture 4" descr="C:\Users\user\Downloads\Dashboard Page.png"/>
+                    <pic:cNvPr id="0" name="Picture 2"/>
                     <pic:cNvPicPr>
                       <a:picLocks noChangeAspect="1" noChangeArrowheads="1"/>
                     </pic:cNvPicPr>
@@ -34255,7 +34220,7 @@
                   <pic:spPr bwMode="auto">
                     <a:xfrm>
                       <a:off x="0" y="0"/>
-                      <a:ext cx="5038725" cy="3171825"/>
+                      <a:ext cx="5041900" cy="3175000"/>
                     </a:xfrm>
                     <a:prstGeom prst="rect">
                       <a:avLst/>
@@ -34373,16 +34338,13 @@
         <w:ind w:firstLine="567"/>
       </w:pPr>
       <w:r>
-        <w:t xml:space="preserve">Halaman </w:t>
-      </w:r>
-      <w:r>
-        <w:rPr>
-          <w:i/>
-        </w:rPr>
-        <w:t xml:space="preserve">Dashboard </w:t>
-      </w:r>
-      <w:r>
-        <w:t>pada Gambar 4.6 berfungsi sebagai halaman utama yang ditampilkan setelah pengguna berhasil melakukan proses autentikasi ke dalam sistem. Halaman ini menyajikan ringkasan informasi mengenai kondisi stok material dan aktivitas pengadaan sehingga pengguna dapat memperoleh gambaran umum mengenai operasional gudang secara cepat tanpa harus membuka setiap menu secara terpisah.</w:t>
+        <w:t xml:space="preserve">Halaman Dashboard </w:t>
+      </w:r>
+      <w:r>
+        <w:t xml:space="preserve">pada Gambar 4.6 </w:t>
+      </w:r>
+      <w:r>
+        <w:t>dirancang sebagai halaman utama setelah pengguna berhasil melakukan login. Halaman ini berfungsi untuk memberikan gambaran umum mengenai kondisi stok material dan aktivitas pengadaan pada King Aluminium Malang. Informasi disajikan dalam bentuk ringkasan dan visualisasi agar pengguna dapat memahami kondisi persediaan dengan cepat.</w:t>
       </w:r>
     </w:p>
     <w:p>
@@ -34391,16 +34353,7 @@
         <w:ind w:firstLine="567"/>
       </w:pPr>
       <w:r>
-        <w:t>Pada bagian atas halaman terdapat empat kartu informasi (</w:t>
-      </w:r>
-      <w:r>
-        <w:rPr>
-          <w:i/>
-        </w:rPr>
-        <w:t>summary cards</w:t>
-      </w:r>
-      <w:r>
-        <w:t>) yang menampilkan jumlah total material yang terdaftar pada sistem, jumlah material dengan status stok aman, jumlah material dengan status stok menipis, serta total pengadaan material yang dilakukan pada bulan berjalan. Informasi tersebut disajikan secara ringkas agar pengguna dapat segera mengetahui kondisi persediaan material yang memerlukan perhatian.</w:t>
+        <w:t>Pada bagian utama dashboard terdapat beberapa kartu informasi, yaitu total material, total stok, stok menipis, dan stok habis. Selain itu, terdapat grafik ringkasan stok material yang membagi kondisi material menjadi stok aman, stok menipis, dan stok habis, serta grafik penggunaan material selama tujuh hari terakhir untuk memberikan gambaran aktivitas penggunaan material.</w:t>
       </w:r>
     </w:p>
     <w:p>
@@ -34409,52 +34362,25 @@
         <w:ind w:firstLine="567"/>
       </w:pPr>
       <w:r>
-        <w:t xml:space="preserve">Selain itu, </w:t>
-      </w:r>
-      <w:r>
-        <w:rPr>
-          <w:i/>
-        </w:rPr>
-        <w:t>dashboard</w:t>
-      </w:r>
-      <w:r>
-        <w:t xml:space="preserve"> juga menampilkan tabel Material Dengan Stok Saat Ini yang berisi informasi nama material, jumlah stok yang tersedia, batas minimum stok, serta status ketersediaan material. Status material ditampilkan menggunakan indikator warna, yaitu hijau untuk stok aman, kuning untuk stok menipis, dan merah untuk stok habis, sehingga memudahkan pengguna dalam mengidentifikasi material yang memerlukan tindakan lebih lanjut.</w:t>
-      </w:r>
-    </w:p>
-    <w:p>
-      <w:pPr>
-        <w:spacing w:line="360" w:lineRule="auto"/>
-        <w:ind w:firstLine="567"/>
-      </w:pPr>
-      <w:r>
+        <w:t>Bagian bawah dashboard menampilkan daftar material dengan stok menipis, material dengan stok habis, serta aktivitas terbaru yang mencakup material masuk, material keluar, dan pengadaan yang diajukan. Pada sisi kiri tersedia sidebar navigasi untuk mengakses fitur Dashboard, Data Material, Pengecekan Stok, Pengadaan Material, Persetujuan Pengadaan, Riwayat Transaksi, dan Logout.</w:t>
+      </w:r>
+    </w:p>
+    <w:p>
+      <w:pPr>
+        <w:keepNext/>
+        <w:spacing w:line="360" w:lineRule="auto"/>
+        <w:jc w:val="center"/>
+      </w:pPr>
+      <w:r>
+        <w:rPr>
+          <w:noProof/>
+        </w:rPr>
         <w:lastRenderedPageBreak/>
-        <w:t xml:space="preserve">Pada sisi kanan halaman ditampilkan Ringkasan Pengadaan Bulan Ini yang memuat informasi mengenai material yang telah dilakukan pengadaan beserta jumlah dan tanggal pengadaan. Ringkasan ini berfungsi sebagai informasi cepat mengenai aktivitas pengadaan yang telah dilakukan selama periode berjalan. Melalui tampilan </w:t>
-      </w:r>
-      <w:r>
-        <w:rPr>
-          <w:i/>
-        </w:rPr>
-        <w:t>dashboard</w:t>
-      </w:r>
-      <w:r>
-        <w:t xml:space="preserve"> tersebut, pengguna dapat melakukan pemantauan kondisi persediaan dan aktivitas pengadaan secara lebih efektif sehingga mendukung proses pengambilan keputusan dalam pengelolaan material.</w:t>
-      </w:r>
-    </w:p>
-    <w:p>
-      <w:pPr>
-        <w:keepNext/>
-        <w:spacing w:line="360" w:lineRule="auto"/>
-        <w:jc w:val="center"/>
-      </w:pPr>
-      <w:r>
-        <w:rPr>
-          <w:noProof/>
-        </w:rPr>
         <w:drawing>
-          <wp:inline distT="0" distB="0" distL="0" distR="0" wp14:anchorId="36B35A06" wp14:editId="4864E036">
-            <wp:extent cx="5037455" cy="3175000"/>
-            <wp:effectExtent l="0" t="0" r="0" b="6350"/>
-            <wp:docPr id="10" name="Picture 10"/>
+          <wp:inline distT="0" distB="0" distL="0" distR="0" wp14:anchorId="44C777E1" wp14:editId="4AAD6676">
+            <wp:extent cx="5041900" cy="3175000"/>
+            <wp:effectExtent l="0" t="0" r="6350" b="6350"/>
+            <wp:docPr id="8" name="Picture 8"/>
             <wp:cNvGraphicFramePr>
               <a:graphicFrameLocks xmlns:a="http://schemas.openxmlformats.org/drawingml/2006/main" noChangeAspect="1"/>
             </wp:cNvGraphicFramePr>
@@ -34462,7 +34388,7 @@
               <a:graphicData uri="http://schemas.openxmlformats.org/drawingml/2006/picture">
                 <pic:pic xmlns:pic="http://schemas.openxmlformats.org/drawingml/2006/picture">
                   <pic:nvPicPr>
-                    <pic:cNvPr id="0" name="Picture 1"/>
+                    <pic:cNvPr id="0" name="Picture 3"/>
                     <pic:cNvPicPr>
                       <a:picLocks noChangeAspect="1" noChangeArrowheads="1"/>
                     </pic:cNvPicPr>
@@ -34483,7 +34409,7 @@
                   <pic:spPr bwMode="auto">
                     <a:xfrm>
                       <a:off x="0" y="0"/>
-                      <a:ext cx="5037455" cy="3175000"/>
+                      <a:ext cx="5041900" cy="3175000"/>
                     </a:xfrm>
                     <a:prstGeom prst="rect">
                       <a:avLst/>
@@ -34592,7 +34518,13 @@
         <w:ind w:firstLine="567"/>
       </w:pPr>
       <w:r>
-        <w:t>Halaman Data Material pada Gambar 4.7 berfungsi sebagai halaman yang digunakan untuk mengelola data material yang tersedia di gudang. Halaman ini menampilkan daftar material dalam bentuk tabel yang memuat informasi berupa ID material, nama material, jenis material, jumlah stok, dan satuan sehingga pengguna dapat melakukan pemantauan serta pengelolaan data material secara terstruktur.</w:t>
+        <w:t>Halaman Data Material</w:t>
+      </w:r>
+      <w:r>
+        <w:t xml:space="preserve"> pada Gambar 4.7</w:t>
+      </w:r>
+      <w:r>
+        <w:t xml:space="preserve"> dirancang untuk mengelola dan menampilkan informasi material yang digunakan dalam proses pengecekan stok pada King Aluminium Malang. Halaman ini menyediakan ringkasan kondisi material melalui beberapa kartu informasi, yaitu total material, stok rendah, material yang tidak memiliki stok, dan total stok.</w:t>
       </w:r>
     </w:p>
     <w:p>
@@ -34601,7 +34533,7 @@
         <w:ind w:firstLine="567"/>
       </w:pPr>
       <w:r>
-        <w:t>Setiap data material dilengkapi dengan tombol Edit dan Hapus pada kolom aksi. Tombol Edit digunakan untuk memperbarui informasi material apabila terjadi perubahan data, sedangkan tombol Hapus digunakan untuk menghapus data material yang sudah tidak digunakan atau tidak lagi tersedia di gudang.</w:t>
+        <w:t>Pada bagian utama terdapat tabel yang menampilkan informasi setiap material, meliputi ID, nama material, satuan, stok saat ini, stok minimum, dan status stok. Status material dibedakan menjadi aman, rendah, dan kosong berdasarkan kondisi stok yang ditampilkan. Tersedia pula fitur pencarian material dan filter kategori untuk membantu pengguna menemukan data tertentu, serta tombol Tambah Material untuk kebutuhan perancangan penambahan data material.</w:t>
       </w:r>
     </w:p>
     <w:p>
@@ -34610,32 +34542,20 @@
         <w:ind w:firstLine="567"/>
       </w:pPr>
       <w:r>
-        <w:t xml:space="preserve">Pada bagian bawah tabel tersedia fitur </w:t>
-      </w:r>
-      <w:r>
-        <w:rPr>
-          <w:i/>
-        </w:rPr>
-        <w:t>pagination</w:t>
-      </w:r>
-      <w:r>
-        <w:t xml:space="preserve"> yang berfungsi untuk membagi tampilan data ke dalam beberapa halaman apabila jumlah data material semakin banyak. Dengan adanya fitur tersebut, pengguna dapat mengakses dan </w:t>
-      </w:r>
-      <w:r>
+        <w:t>Pada kolom aksi, prototype menyediakan tombol Masuk dan Keluar yang menggambarkan interaksi pencatatan material masuk dan keluar. Terdapat pula fitur Export Excel serta navigasi halaman (pagination) untuk mendukung pengelolaan data dalam jumlah lebih banyak.</w:t>
+      </w:r>
+    </w:p>
+    <w:p>
+      <w:pPr>
+        <w:keepNext/>
+        <w:spacing w:line="360" w:lineRule="auto"/>
+        <w:jc w:val="center"/>
+      </w:pPr>
+      <w:r>
+        <w:rPr>
+          <w:noProof/>
+        </w:rPr>
         <w:lastRenderedPageBreak/>
-        <w:t>mengelola data material secara lebih efektif sesuai dengan kebutuhan operasional King Aluminium Malang.</w:t>
-      </w:r>
-    </w:p>
-    <w:p>
-      <w:pPr>
-        <w:keepNext/>
-        <w:spacing w:line="360" w:lineRule="auto"/>
-        <w:jc w:val="center"/>
-      </w:pPr>
-      <w:r>
-        <w:rPr>
-          <w:noProof/>
-        </w:rPr>
         <w:drawing>
           <wp:inline distT="0" distB="0" distL="0" distR="0" wp14:anchorId="49641EB3" wp14:editId="5A8B18AE">
             <wp:extent cx="4919134" cy="3096544"/>
@@ -34778,7 +34698,13 @@
         <w:ind w:firstLine="567"/>
       </w:pPr>
       <w:r>
-        <w:t>Halaman Tambah Material pada Gambar 4.8 berfungsi sebagai halaman yang digunakan untuk menambahkan data material baru ke dalam sistem. Halaman ini memungkinkan pengguna mencatat informasi material yang akan disimpan sebagai data persediaan sehingga proses pengelolaan stok dapat dilakukan secara lebih terstruktur dan terdokumentasi.</w:t>
+        <w:t xml:space="preserve">Halaman Tambah Material </w:t>
+      </w:r>
+      <w:r>
+        <w:t xml:space="preserve">pada Gambar 4.8 </w:t>
+      </w:r>
+      <w:r>
+        <w:t>dirancang untuk menyediakan form yang digunakan pengguna dalam memasukkan data material baru ke dalam sistem. Halaman ini dapat diakses melalui menu Data Material dan dilengkapi breadcrumb sebagai penunjuk posisi halaman.</w:t>
       </w:r>
     </w:p>
     <w:p>
@@ -34787,16 +34713,7 @@
         <w:ind w:firstLine="567"/>
       </w:pPr>
       <w:r>
-        <w:t xml:space="preserve">Pada halaman ini tersedia beberapa komponen </w:t>
-      </w:r>
-      <w:r>
-        <w:rPr>
-          <w:i/>
-        </w:rPr>
-        <w:t>input</w:t>
-      </w:r>
-      <w:r>
-        <w:t xml:space="preserve"> yang harus diisi oleh pengguna, yaitu Nama Material, Jenis Material, Jumlah Material, Satuan, dan Batas Minimum Stok. Setiap informasi tersebut digunakan sebagai data dasar dalam proses pencatatan material. Kolom Batas Minimum Stok berfungsi sebagai acuan sistem dalam menentukan kondisi ketersediaan material sehingga dapat memberikan informasi apabila stok berada di bawah batas yang telah ditentukan.</w:t>
+        <w:t>Form terdiri dari beberapa input, yaitu nama material, jenis material, jumlah material, satuan, dan batas minimum stok. Pengguna juga disediakan tombol Simpan untuk menggambarkan proses penyimpanan data serta tombol Batal untuk membatalkan pengisian form.</w:t>
       </w:r>
     </w:p>
     <w:p>
@@ -34805,28 +34722,27 @@
         <w:ind w:firstLine="567"/>
       </w:pPr>
       <w:r>
-        <w:t xml:space="preserve">Pada bagian bawah halaman terdapat tombol Simpan dan Batal. Tombol Simpan digunakan untuk menyimpan data material yang telah diinput ke dalam sistem, sedangkan tombol Batal digunakan untuk membatalkan proses penambahan data dan mengembalikan pengguna ke halaman sebelumnya tanpa menyimpan perubahan. Dengan adanya halaman Tambah Material, proses pencatatan material </w:t>
-      </w:r>
-      <w:r>
+        <w:t>Perancangan dibuat dengan struktur form yang sederhana dan terorganisir agar proses input data material dapat dilakukan dengan mudah. Halaman ini masih berupa prototype antarmuka yang digunakan untuk menggambarkan rancangan dan alur interaksi penambahan material, sehingga belum membahas implementasi penyimpanan data ke database maupun proses validasi secara nyata.</w:t>
+      </w:r>
+    </w:p>
+    <w:p>
+      <w:pPr>
+        <w:keepNext/>
+        <w:spacing w:line="360" w:lineRule="auto"/>
+      </w:pPr>
+      <w:r>
+        <w:rPr>
+          <w:b/>
+          <w:iCs/>
+          <w:noProof/>
+          <w:szCs w:val="24"/>
+        </w:rPr>
         <w:lastRenderedPageBreak/>
-        <w:t>baru dapat dilakukan secara lebih mudah, konsisten, dan mendukung pengelolaan data persediaan pada King Aluminium Malang.</w:t>
-      </w:r>
-    </w:p>
-    <w:p>
-      <w:pPr>
-        <w:keepNext/>
-        <w:spacing w:line="360" w:lineRule="auto"/>
-        <w:jc w:val="center"/>
-      </w:pPr>
-      <w:r>
-        <w:rPr>
-          <w:noProof/>
-        </w:rPr>
         <w:drawing>
-          <wp:inline distT="0" distB="0" distL="0" distR="0" wp14:anchorId="2CB331FA" wp14:editId="6CAD78F2">
-            <wp:extent cx="5038725" cy="3171825"/>
-            <wp:effectExtent l="0" t="0" r="9525" b="9525"/>
-            <wp:docPr id="24" name="Picture 24" descr="C:\Users\user\Downloads\Pengecekan Stok Page.png"/>
+          <wp:inline distT="0" distB="0" distL="0" distR="0" wp14:anchorId="3F7E565E" wp14:editId="6BB25F6B">
+            <wp:extent cx="5041900" cy="3175000"/>
+            <wp:effectExtent l="0" t="0" r="6350" b="6350"/>
+            <wp:docPr id="9" name="Picture 9"/>
             <wp:cNvGraphicFramePr>
               <a:graphicFrameLocks xmlns:a="http://schemas.openxmlformats.org/drawingml/2006/main" noChangeAspect="1"/>
             </wp:cNvGraphicFramePr>
@@ -34834,7 +34750,7 @@
               <a:graphicData uri="http://schemas.openxmlformats.org/drawingml/2006/picture">
                 <pic:pic xmlns:pic="http://schemas.openxmlformats.org/drawingml/2006/picture">
                   <pic:nvPicPr>
-                    <pic:cNvPr id="0" name="Picture 7" descr="C:\Users\user\Downloads\Pengecekan Stok Page.png"/>
+                    <pic:cNvPr id="0" name="Picture 4"/>
                     <pic:cNvPicPr>
                       <a:picLocks noChangeAspect="1" noChangeArrowheads="1"/>
                     </pic:cNvPicPr>
@@ -34855,7 +34771,7 @@
                   <pic:spPr bwMode="auto">
                     <a:xfrm>
                       <a:off x="0" y="0"/>
-                      <a:ext cx="5038725" cy="3171825"/>
+                      <a:ext cx="5041900" cy="3175000"/>
                     </a:xfrm>
                     <a:prstGeom prst="rect">
                       <a:avLst/>
@@ -34884,7 +34800,6 @@
           <w:szCs w:val="24"/>
         </w:rPr>
       </w:pPr>
-      <w:bookmarkStart w:id="87" w:name="_Toc236356531"/>
       <w:r>
         <w:rPr>
           <w:b/>
@@ -34954,9 +34869,8 @@
           <w:sz w:val="24"/>
           <w:szCs w:val="24"/>
         </w:rPr>
-        <w:t xml:space="preserve"> Halaman Pengecekan Stok Material</w:t>
-      </w:r>
-      <w:bookmarkEnd w:id="87"/>
+        <w:t xml:space="preserve"> Halaman Material Masuk</w:t>
+      </w:r>
     </w:p>
     <w:p>
       <w:pPr>
@@ -34964,7 +34878,13 @@
         <w:ind w:firstLine="567"/>
       </w:pPr>
       <w:r>
-        <w:t>Halaman Pengecekan Stok Material pada Gambar 4.9 berfungsi sebagai halaman yang digunakan untuk memantau ketersediaan stok material di gudang. Halaman ini menyajikan informasi mengenai jumlah stok setiap material beserta status ketersediaannya sehingga pengguna dapat mengetahui kondisi persediaan secara cepat dan menentukan apakah diperlukan tindakan pengadaan material.</w:t>
+        <w:t>Halaman Material Masuk</w:t>
+      </w:r>
+      <w:r>
+        <w:t xml:space="preserve"> pada Gambar 4.9</w:t>
+      </w:r>
+      <w:r>
+        <w:t xml:space="preserve"> dirancang untuk menggambarkan proses pencatatan transaksi material yang masuk ke dalam persediaan. Halaman ini menyediakan form untuk memilih nama material, jenis material, jenis transaksi, jumlah material, tanggal transaksi, serta tujuan/keterangan sebagai informasi pendukung transaksi.</w:t>
       </w:r>
     </w:p>
     <w:p>
@@ -34973,46 +34893,38 @@
         <w:ind w:firstLine="567"/>
       </w:pPr>
       <w:r>
-        <w:t>Pada halaman ini ditampilkan daftar material dalam bentuk tabel yang memuat informasi berupa nama material, jumlah stok yang tersedia, batas minimum stok, serta status ketersediaan material. Status material ditampilkan menggunakan indikator warna untuk memudahkan pengguna dalam mengidentifikasi kondisi stok, yaitu hijau untuk status Aman, kuning untuk status Menipis, dan merah untuk status Habis.</w:t>
-      </w:r>
-    </w:p>
-    <w:p>
-      <w:pPr>
-        <w:spacing w:line="360" w:lineRule="auto"/>
-        <w:ind w:firstLine="720"/>
-      </w:pPr>
-      <w:r>
-        <w:t>Selain itu, pada bagian kanan atas halaman tersedia fitur pencarian (</w:t>
-      </w:r>
-      <w:r>
-        <w:rPr>
-          <w:i/>
-        </w:rPr>
-        <w:t>search</w:t>
-      </w:r>
-      <w:r>
-        <w:t xml:space="preserve">) yang memungkinkan pengguna mencari material berdasarkan nama sehingga proses pengecekan stok dapat dilakukan dengan lebih cepat dan efisien. Dengan adanya halaman Pengecekan Stok Material, pengguna dapat memonitor kondisi persediaan secara berkala dan mengidentifikasi material yang telah mencapai atau </w:t>
-      </w:r>
-      <w:r>
+        <w:t>Pada bagian kanan form terdapat informasi stok saat ini, estimasi stok setelah transaksi, serta informasi material berupa nama material, batas minimum stok, dan status stok. Tampilan estimasi stok digunakan untuk memberikan gambaran perubahan jumlah persediaan setelah material masuk, sehingga pengguna dapat mengetahui kondisi stok sebelum menyimpan transaksi.</w:t>
+      </w:r>
+    </w:p>
+    <w:p>
+      <w:pPr>
+        <w:spacing w:line="360" w:lineRule="auto"/>
+        <w:ind w:firstLine="567"/>
+      </w:pPr>
+      <w:r>
+        <w:t>Tersedia tombol Simpan Transaksi untuk menggambarkan aksi penyimpanan transaksi dan tombol Batal untuk membatalkan proses pencatatan. Halaman ini masih berupa prototype perancangan antarmuka yang digunakan untuk menggambarkan struktur form dan alur interaksi pencatatan material masuk. Perhitungan stok, penyimpanan transaksi, dan integrasi database belum diimplementasikan pada tahap prototype.</w:t>
+      </w:r>
+    </w:p>
+    <w:p>
+      <w:pPr>
+        <w:spacing w:line="360" w:lineRule="auto"/>
+      </w:pPr>
+    </w:p>
+    <w:p>
+      <w:pPr>
+        <w:keepNext/>
+        <w:spacing w:line="360" w:lineRule="auto"/>
+      </w:pPr>
+      <w:r>
+        <w:rPr>
+          <w:noProof/>
+        </w:rPr>
         <w:lastRenderedPageBreak/>
-        <w:t>berada di bawah batas minimum stok sebagai dasar dalam proses pengadaan material pada King Aluminium Malang.</w:t>
-      </w:r>
-    </w:p>
-    <w:p>
-      <w:pPr>
-        <w:keepNext/>
-        <w:spacing w:line="360" w:lineRule="auto"/>
-        <w:jc w:val="center"/>
-      </w:pPr>
-      <w:r>
-        <w:rPr>
-          <w:noProof/>
-        </w:rPr>
         <w:drawing>
-          <wp:inline distT="0" distB="0" distL="0" distR="0" wp14:anchorId="44659139" wp14:editId="7006159C">
-            <wp:extent cx="5038725" cy="3171825"/>
-            <wp:effectExtent l="0" t="0" r="9525" b="9525"/>
-            <wp:docPr id="25" name="Picture 25" descr="C:\Users\user\Downloads\Pengadaan Material Page.png"/>
+          <wp:inline distT="0" distB="0" distL="0" distR="0" wp14:anchorId="37124DEC" wp14:editId="56637901">
+            <wp:extent cx="5041900" cy="3175000"/>
+            <wp:effectExtent l="0" t="0" r="6350" b="6350"/>
+            <wp:docPr id="11" name="Picture 11"/>
             <wp:cNvGraphicFramePr>
               <a:graphicFrameLocks xmlns:a="http://schemas.openxmlformats.org/drawingml/2006/main" noChangeAspect="1"/>
             </wp:cNvGraphicFramePr>
@@ -35020,7 +34932,7 @@
               <a:graphicData uri="http://schemas.openxmlformats.org/drawingml/2006/picture">
                 <pic:pic xmlns:pic="http://schemas.openxmlformats.org/drawingml/2006/picture">
                   <pic:nvPicPr>
-                    <pic:cNvPr id="0" name="Picture 8" descr="C:\Users\user\Downloads\Pengadaan Material Page.png"/>
+                    <pic:cNvPr id="0" name="Picture 5"/>
                     <pic:cNvPicPr>
                       <a:picLocks noChangeAspect="1" noChangeArrowheads="1"/>
                     </pic:cNvPicPr>
@@ -35041,7 +34953,7 @@
                   <pic:spPr bwMode="auto">
                     <a:xfrm>
                       <a:off x="0" y="0"/>
-                      <a:ext cx="5038725" cy="3171825"/>
+                      <a:ext cx="5041900" cy="3175000"/>
                     </a:xfrm>
                     <a:prstGeom prst="rect">
                       <a:avLst/>
@@ -35070,7 +34982,6 @@
           <w:szCs w:val="24"/>
         </w:rPr>
       </w:pPr>
-      <w:bookmarkStart w:id="88" w:name="_Toc236356532"/>
       <w:r>
         <w:rPr>
           <w:b/>
@@ -35140,9 +35051,8 @@
           <w:sz w:val="24"/>
           <w:szCs w:val="24"/>
         </w:rPr>
-        <w:t xml:space="preserve"> Halaman Pengadaan Material</w:t>
-      </w:r>
-      <w:bookmarkEnd w:id="88"/>
+        <w:t xml:space="preserve"> Halaman Material Keluar</w:t>
+      </w:r>
     </w:p>
     <w:p>
       <w:pPr>
@@ -35150,7 +35060,7 @@
         <w:ind w:firstLine="567"/>
       </w:pPr>
       <w:r>
-        <w:t>Halaman Pengadaan Material pada Gambar 4.10 berfungsi sebagai halaman yang digunakan untuk memantau dan mengelola seluruh aktivitas pengadaan material. Halaman ini menyajikan informasi mengenai status setiap pengadaan sehingga pengguna dapat mengetahui perkembangan proses pengadaan material mulai dari pengajuan hingga selesai.</w:t>
+        <w:t>Halaman Material Keluar dirancang untuk menggambarkan proses pencatatan transaksi material yang keluar dari persediaan. Halaman ini menyediakan form untuk memilih nama material, jenis material, jenis transaksi, jumlah material, tanggal transaksi, serta tujuan/keterangan sebagai informasi pendukung transaksi.</w:t>
       </w:r>
     </w:p>
     <w:p>
@@ -35159,16 +35069,7 @@
         <w:ind w:firstLine="567"/>
       </w:pPr>
       <w:r>
-        <w:t>Pada bagian atas halaman ditampilkan beberapa kartu informasi (</w:t>
-      </w:r>
-      <w:r>
-        <w:rPr>
-          <w:i/>
-        </w:rPr>
-        <w:t>summary cards</w:t>
-      </w:r>
-      <w:r>
-        <w:t>) yang memuat ringkasan jumlah Total Pengadaan, Menunggu, Diproses, dan Selesai. Informasi tersebut memberikan gambaran umum mengenai kondisi pengadaan material yang sedang berlangsung sehingga memudahkan pengguna dalam melakukan pemantauan.</w:t>
+        <w:t>Pada bagian kanan form terdapat informasi stok saat ini dan estimasi stok setelah transaksi. Pada prototype, estimasi tersebut menunjukkan perubahan jumlah stok setelah material dikeluarkan, sehingga pengguna dapat melihat gambaran kondisi persediaan sebelum transaksi disimpan. Informasi minimum stok dan status material juga ditampilkan sebagai referensi dalam proses pencatatan.</w:t>
       </w:r>
     </w:p>
     <w:p>
@@ -35177,64 +35078,24 @@
         <w:ind w:firstLine="567"/>
       </w:pPr>
       <w:r>
-        <w:t>Selain itu, pada bagian kanan atas tersedia tombol Ajukan Pengadaan yang digunakan untuk membuat permohonan pengadaan material baru. Di bawahnya terdapat fitur pencarian (</w:t>
-      </w:r>
-      <w:r>
-        <w:rPr>
-          <w:i/>
-        </w:rPr>
-        <w:t>search</w:t>
-      </w:r>
-      <w:r>
-        <w:t>) dan filter status yang memungkinkan pengguna mencari data pengadaan berdasarkan nama material maupun menyaring data sesuai status pengadaannya.</w:t>
-      </w:r>
-    </w:p>
-    <w:p>
-      <w:pPr>
-        <w:spacing w:line="360" w:lineRule="auto"/>
-        <w:ind w:firstLine="567"/>
-      </w:pPr>
-      <w:r>
-        <w:t xml:space="preserve">Data pengadaan ditampilkan dalam bentuk tabel yang memuat informasi berupa ID pengadaan, nama material, jumlah material yang diajukan, </w:t>
-      </w:r>
-      <w:r>
-        <w:rPr>
-          <w:i/>
-        </w:rPr>
-        <w:t>supplier</w:t>
-      </w:r>
-      <w:r>
-        <w:t xml:space="preserve">, </w:t>
-      </w:r>
-      <w:r>
+        <w:t>Tersedia tombol Simpan Transaksi untuk menggambarkan aksi penyimpanan transaksi dan tombol Batal untuk membatalkan proses pencatatan. Halaman ini masih berupa prototype perancangan antarmuka yang digunakan untuk menggambarkan struktur form dan alur interaksi pencatatan material keluar. Perhitungan stok, penyimpanan transaksi, dan integrasi database belum diimplementasikan pada tahap prototype.</w:t>
+      </w:r>
+    </w:p>
+    <w:p>
+      <w:pPr>
+        <w:keepNext/>
+        <w:spacing w:line="360" w:lineRule="auto"/>
+      </w:pPr>
+      <w:r>
+        <w:rPr>
+          <w:noProof/>
+        </w:rPr>
         <w:lastRenderedPageBreak/>
-        <w:t>tanggal pemesanan, serta status pengadaan. Status pengadaan dibedakan menjadi tiga kategori, yaitu Menunggu, Diproses, dan Selesai, sehingga pengguna dapat memantau perkembangan setiap proses pengadaan secara lebih mudah dan terstruktur.</w:t>
-      </w:r>
-    </w:p>
-    <w:p>
-      <w:pPr>
-        <w:spacing w:line="360" w:lineRule="auto"/>
-        <w:ind w:firstLine="567"/>
-      </w:pPr>
-      <w:r>
-        <w:t>Dengan adanya halaman Pengadaan Material, proses monitoring aktivitas pengadaan dapat dilakukan secara lebih efektif, transparan, dan terdokumentasi. Informasi yang ditampilkan pada halaman ini membantu pengguna dalam mengawasi setiap proses pengadaan material serta memastikan kebutuhan material dapat dipenuhi sesuai dengan kondisi stok di King Aluminium Malang.</w:t>
-      </w:r>
-    </w:p>
-    <w:p>
-      <w:pPr>
-        <w:keepNext/>
-        <w:spacing w:line="360" w:lineRule="auto"/>
-        <w:jc w:val="center"/>
-      </w:pPr>
-      <w:r>
-        <w:rPr>
-          <w:noProof/>
-        </w:rPr>
         <w:drawing>
-          <wp:inline distT="0" distB="0" distL="0" distR="0" wp14:anchorId="66AAA355" wp14:editId="4D1E66F5">
-            <wp:extent cx="5038725" cy="3171825"/>
-            <wp:effectExtent l="0" t="0" r="9525" b="9525"/>
-            <wp:docPr id="26" name="Picture 26" descr="C:\Users\user\Downloads\Ajukan Pengadaan Page.png"/>
+          <wp:inline distT="0" distB="0" distL="0" distR="0" wp14:anchorId="049F5DF4" wp14:editId="7F5E6633">
+            <wp:extent cx="5041900" cy="3175000"/>
+            <wp:effectExtent l="0" t="0" r="6350" b="6350"/>
+            <wp:docPr id="14" name="Picture 14"/>
             <wp:cNvGraphicFramePr>
               <a:graphicFrameLocks xmlns:a="http://schemas.openxmlformats.org/drawingml/2006/main" noChangeAspect="1"/>
             </wp:cNvGraphicFramePr>
@@ -35242,7 +35103,7 @@
               <a:graphicData uri="http://schemas.openxmlformats.org/drawingml/2006/picture">
                 <pic:pic xmlns:pic="http://schemas.openxmlformats.org/drawingml/2006/picture">
                   <pic:nvPicPr>
-                    <pic:cNvPr id="0" name="Picture 9" descr="C:\Users\user\Downloads\Ajukan Pengadaan Page.png"/>
+                    <pic:cNvPr id="0" name="Picture 6"/>
                     <pic:cNvPicPr>
                       <a:picLocks noChangeAspect="1" noChangeArrowheads="1"/>
                     </pic:cNvPicPr>
@@ -35263,7 +35124,7 @@
                   <pic:spPr bwMode="auto">
                     <a:xfrm>
                       <a:off x="0" y="0"/>
-                      <a:ext cx="5038725" cy="3171825"/>
+                      <a:ext cx="5041900" cy="3175000"/>
                     </a:xfrm>
                     <a:prstGeom prst="rect">
                       <a:avLst/>
@@ -35292,7 +35153,6 @@
           <w:szCs w:val="24"/>
         </w:rPr>
       </w:pPr>
-      <w:bookmarkStart w:id="89" w:name="_Toc236356533"/>
       <w:r>
         <w:rPr>
           <w:b/>
@@ -35362,9 +35222,8 @@
           <w:sz w:val="24"/>
           <w:szCs w:val="24"/>
         </w:rPr>
-        <w:t xml:space="preserve"> Halaman Ajukan Pengadaan Material</w:t>
-      </w:r>
-      <w:bookmarkEnd w:id="89"/>
+        <w:t xml:space="preserve"> Halaman Pengecekan Stok</w:t>
+      </w:r>
     </w:p>
     <w:p>
       <w:pPr>
@@ -35372,7 +35231,13 @@
         <w:ind w:firstLine="567"/>
       </w:pPr>
       <w:r>
-        <w:t>Halaman Ajukan Pengadaan pada Gambar 4.11 berfungsi sebagai halaman yang digunakan oleh admin untuk mengajukan permohonan pengadaan material apabila stok yang tersedia di gudang tidak mencukupi kebutuhan operasional. Halaman ini dirancang untuk mencatat informasi pengadaan secara lengkap sehingga proses pengajuan dapat dilakukan secara terstruktur sebelum diteruskan kepada pemilik usaha untuk proses persetujuan.</w:t>
+        <w:t>Halaman Pengecekan Stok</w:t>
+      </w:r>
+      <w:r>
+        <w:t xml:space="preserve"> pada Gambar 4.11</w:t>
+      </w:r>
+      <w:r>
+        <w:t xml:space="preserve"> dirancang untuk memantau kondisi ketersediaan material berdasarkan jumlah stok saat ini dan batas minimum stok. Halaman ini menampilkan ringkasan kondisi material melalui empat kartu informasi, yaitu total material, stok aman, stok menipis, dan stok habis.</w:t>
       </w:r>
     </w:p>
     <w:p>
@@ -35381,52 +35246,33 @@
         <w:ind w:firstLine="567"/>
       </w:pPr>
       <w:r>
-        <w:t xml:space="preserve">Pada halaman ini tersedia beberapa komponen input yang harus diisi oleh pengguna, yaitu Nama Material, Jumlah Material, Supplier, Tanggal Pemesanan, dan Estimasi Kedatangan. Informasi tersebut digunakan sebagai dasar dalam proses pengajuan pengadaan material, mulai dari menentukan material yang akan dipesan, </w:t>
-      </w:r>
-      <w:r>
+        <w:t>Pada bagian utama terdapat tabel yang menampilkan ID material, nama material, satuan, stok saat ini, stok minimum, dan status stok. Pengguna dapat menggunakan fitur pencarian dan filter status untuk mempermudah pencarian material tertentu. Tersedia pula fitur Export Excel sebagai bagian dari rancangan pengelolaan data.</w:t>
+      </w:r>
+    </w:p>
+    <w:p>
+      <w:pPr>
+        <w:spacing w:line="360" w:lineRule="auto"/>
+        <w:ind w:firstLine="567"/>
+      </w:pPr>
+      <w:r>
+        <w:t>Pada kolom aksi, material dengan kondisi stok aman dapat dilihat melalui tombol Detail, sedangkan material dengan kondisi menipis atau habis menyediakan tombol Ajukan Pengadaan. Rancangan ini menunjukkan hubungan antara proses pengecekan kondisi stok dengan kebutuhan pengadaan material ketika persediaan berada di bawah batas minimum.</w:t>
+      </w:r>
+    </w:p>
+    <w:p>
+      <w:pPr>
+        <w:keepNext/>
+        <w:spacing w:line="360" w:lineRule="auto"/>
+      </w:pPr>
+      <w:r>
+        <w:rPr>
+          <w:noProof/>
+        </w:rPr>
         <w:lastRenderedPageBreak/>
-        <w:t xml:space="preserve">jumlah kebutuhan, </w:t>
-      </w:r>
-      <w:r>
-        <w:rPr>
-          <w:i/>
-        </w:rPr>
-        <w:t>supplier</w:t>
-      </w:r>
-      <w:r>
-        <w:rPr>
-          <w:i/>
-        </w:rPr>
-        <w:t xml:space="preserve"> </w:t>
-      </w:r>
-      <w:r>
-        <w:t>yang dipilih, hingga jadwal pemesanan dan perkiraan waktu kedatangan material.</w:t>
-      </w:r>
-    </w:p>
-    <w:p>
-      <w:pPr>
-        <w:spacing w:line="360" w:lineRule="auto"/>
-        <w:ind w:firstLine="567"/>
-      </w:pPr>
-      <w:r>
-        <w:t>Pada bagian bawah halaman terdapat tombol Ajukan Pengadaan dan Batal. Tombol Ajukan Pengadaan digunakan untuk mengirimkan permohonan pengadaan material agar dapat diproses pada tahap berikutnya, sedangkan tombol Batal digunakan untuk membatalkan proses pengajuan tanpa menyimpan perubahan. Dengan adanya halaman Ajukan Pengadaan, proses pengajuan kebutuhan material dapat dilakukan secara lebih terstruktur, terdokumentasi, dan mendukung kelancaran proses pengadaan material di King Aluminium Malang.</w:t>
-      </w:r>
-    </w:p>
-    <w:p>
-      <w:pPr>
-        <w:keepNext/>
-        <w:spacing w:line="360" w:lineRule="auto"/>
-        <w:jc w:val="center"/>
-      </w:pPr>
-      <w:r>
-        <w:rPr>
-          <w:noProof/>
-        </w:rPr>
         <w:drawing>
-          <wp:inline distT="0" distB="0" distL="0" distR="0" wp14:anchorId="4CEE9F8A" wp14:editId="26A08C6B">
-            <wp:extent cx="5038725" cy="3171825"/>
-            <wp:effectExtent l="0" t="0" r="9525" b="9525"/>
-            <wp:docPr id="27" name="Picture 27" descr="C:\Users\user\Downloads\Persetujuan Pengadaan Page.png"/>
+          <wp:inline distT="0" distB="0" distL="0" distR="0" wp14:anchorId="77575A9E" wp14:editId="7D770D74">
+            <wp:extent cx="5041900" cy="3175000"/>
+            <wp:effectExtent l="0" t="0" r="6350" b="6350"/>
+            <wp:docPr id="17" name="Picture 17"/>
             <wp:cNvGraphicFramePr>
               <a:graphicFrameLocks xmlns:a="http://schemas.openxmlformats.org/drawingml/2006/main" noChangeAspect="1"/>
             </wp:cNvGraphicFramePr>
@@ -35434,7 +35280,7 @@
               <a:graphicData uri="http://schemas.openxmlformats.org/drawingml/2006/picture">
                 <pic:pic xmlns:pic="http://schemas.openxmlformats.org/drawingml/2006/picture">
                   <pic:nvPicPr>
-                    <pic:cNvPr id="0" name="Picture 10" descr="C:\Users\user\Downloads\Persetujuan Pengadaan Page.png"/>
+                    <pic:cNvPr id="0" name="Picture 7"/>
                     <pic:cNvPicPr>
                       <a:picLocks noChangeAspect="1" noChangeArrowheads="1"/>
                     </pic:cNvPicPr>
@@ -35455,7 +35301,7 @@
                   <pic:spPr bwMode="auto">
                     <a:xfrm>
                       <a:off x="0" y="0"/>
-                      <a:ext cx="5038725" cy="3171825"/>
+                      <a:ext cx="5041900" cy="3175000"/>
                     </a:xfrm>
                     <a:prstGeom prst="rect">
                       <a:avLst/>
@@ -35484,7 +35330,6 @@
           <w:szCs w:val="24"/>
         </w:rPr>
       </w:pPr>
-      <w:bookmarkStart w:id="90" w:name="_Toc236356534"/>
       <w:r>
         <w:rPr>
           <w:b/>
@@ -35554,9 +35399,8 @@
           <w:sz w:val="24"/>
           <w:szCs w:val="24"/>
         </w:rPr>
-        <w:t xml:space="preserve"> Halaman Persetujuan Pengadaan</w:t>
-      </w:r>
-      <w:bookmarkEnd w:id="90"/>
+        <w:t xml:space="preserve"> Halaman Pengadaan Material</w:t>
+      </w:r>
     </w:p>
     <w:p>
       <w:pPr>
@@ -35564,7 +35408,13 @@
         <w:ind w:firstLine="567"/>
       </w:pPr>
       <w:r>
-        <w:t>Halaman Persetujuan Pengadaan pada Gambar 4.12 berfungsi sebagai halaman yang digunakan oleh pemilik usaha untuk meninjau dan memberikan keputusan terhadap setiap pengajuan pengadaan material yang telah diajukan oleh admin. Halaman ini dirancang untuk membantu proses pengambilan keputusan sehingga setiap pengadaan material dapat dikendalikan dan disetujui sesuai dengan kebutuhan operasional perusahaan.</w:t>
+        <w:t xml:space="preserve">Halaman Pengadaan Material </w:t>
+      </w:r>
+      <w:r>
+        <w:t xml:space="preserve">pada Gambar 4.12 </w:t>
+      </w:r>
+      <w:r>
+        <w:t>dirancang untuk memantau proses pengadaan material mulai dari pengajuan hingga pengadaan selesai. Halaman ini menyediakan ringkasan melalui beberapa kartu informasi, yaitu total pengadaan, pengadaan yang menunggu, sedang diproses, dan pengadaan yang telah selesai.</w:t>
       </w:r>
     </w:p>
     <w:p>
@@ -35573,64 +35423,33 @@
         <w:ind w:firstLine="567"/>
       </w:pPr>
       <w:r>
-        <w:t>Pada bagian atas halaman ditampilkan beberapa kartu informasi (</w:t>
-      </w:r>
-      <w:r>
-        <w:rPr>
-          <w:i/>
-        </w:rPr>
-        <w:t>summary cards</w:t>
-      </w:r>
-      <w:r>
-        <w:t xml:space="preserve">) yang memuat ringkasan jumlah Total Pengajuan, Menunggu, Disetujui, dan Ditolak. Informasi tersebut memberikan gambaran mengenai kondisi keseluruhan </w:t>
-      </w:r>
-      <w:r>
+        <w:t>Pada bagian utama terdapat tabel yang menampilkan informasi ID, nama material, jumlah, supplier, tanggal pemesanan, dan status pengadaan. Status pengadaan dibedakan menjadi Menunggu, Diproses, dan Selesai untuk memberikan gambaran tahapan proses pengadaan. Tersedia pula fitur pencarian dan filter status untuk mempermudah pengguna dalam menemukan data pengadaan tertentu.</w:t>
+      </w:r>
+    </w:p>
+    <w:p>
+      <w:pPr>
+        <w:spacing w:line="360" w:lineRule="auto"/>
+        <w:ind w:firstLine="567"/>
+      </w:pPr>
+      <w:r>
+        <w:t>Tombol Ajukan Pengadaan pada bagian kanan atas dirancang sebagai akses untuk memulai proses pengajuan pengadaan material. Dengan demikian, halaman ini menggambarkan alur pengelolaan pengadaan dari pengajuan hingga pemantauan statusnya.</w:t>
+      </w:r>
+    </w:p>
+    <w:p>
+      <w:pPr>
+        <w:keepNext/>
+        <w:spacing w:line="360" w:lineRule="auto"/>
+      </w:pPr>
+      <w:r>
+        <w:rPr>
+          <w:noProof/>
+        </w:rPr>
         <w:lastRenderedPageBreak/>
-        <w:t>proses persetujuan pengadaan sehingga memudahkan pemilik usaha dalam memantau status setiap pengajuan yang masuk.</w:t>
-      </w:r>
-    </w:p>
-    <w:p>
-      <w:pPr>
-        <w:spacing w:line="360" w:lineRule="auto"/>
-        <w:ind w:firstLine="567"/>
-      </w:pPr>
-      <w:r>
-        <w:t xml:space="preserve">Data pengajuan ditampilkan dalam bentuk tabel yang memuat informasi berupa ID pengajuan, nama material, jumlah material, </w:t>
-      </w:r>
-      <w:r>
-        <w:rPr>
-          <w:i/>
-        </w:rPr>
-        <w:t>supplier</w:t>
-      </w:r>
-      <w:r>
-        <w:t>, tanggal pengajuan, estimasi kedatangan, status, serta aksi yang dapat dilakukan oleh pemilik usaha. Pada kolom Aksi, tersedia tombol Setujui dan Tolak yang digunakan untuk memberikan keputusan terhadap pengajuan yang masih berstatus Menunggu. Setelah keputusan diberikan, status pengajuan akan berubah menjadi Disetujui atau Ditolak sesuai dengan keputusan yang dipilih.</w:t>
-      </w:r>
-    </w:p>
-    <w:p>
-      <w:pPr>
-        <w:spacing w:line="360" w:lineRule="auto"/>
-        <w:ind w:firstLine="567"/>
-      </w:pPr>
-      <w:r>
-        <w:t>Dengan adanya halaman Persetujuan Pengadaan, proses persetujuan pengadaan material dapat dilakukan secara lebih terstruktur, transparan, dan terdokumentasi. Halaman ini juga membantu memastikan bahwa setiap proses pembelian material telah melalui tahapan persetujuan dari pemilik usaha sebelum dilaksanakan, sehingga pengelolaan pengadaan material di King Aluminium Malang dapat berjalan lebih terkontrol.</w:t>
-      </w:r>
-    </w:p>
-    <w:p>
-      <w:pPr>
-        <w:keepNext/>
-        <w:spacing w:line="360" w:lineRule="auto"/>
-        <w:jc w:val="center"/>
-      </w:pPr>
-      <w:r>
-        <w:rPr>
-          <w:noProof/>
-        </w:rPr>
         <w:drawing>
-          <wp:inline distT="0" distB="0" distL="0" distR="0" wp14:anchorId="3A745755" wp14:editId="13B7CA17">
-            <wp:extent cx="5038725" cy="3171825"/>
-            <wp:effectExtent l="0" t="0" r="9525" b="9525"/>
-            <wp:docPr id="28" name="Picture 28" descr="C:\Users\user\Downloads\Riwayat Transaksi Page.png"/>
+          <wp:inline distT="0" distB="0" distL="0" distR="0" wp14:anchorId="18BC613C" wp14:editId="140A9F95">
+            <wp:extent cx="5041900" cy="3175000"/>
+            <wp:effectExtent l="0" t="0" r="6350" b="6350"/>
+            <wp:docPr id="19" name="Picture 19"/>
             <wp:cNvGraphicFramePr>
               <a:graphicFrameLocks xmlns:a="http://schemas.openxmlformats.org/drawingml/2006/main" noChangeAspect="1"/>
             </wp:cNvGraphicFramePr>
@@ -35638,7 +35457,7 @@
               <a:graphicData uri="http://schemas.openxmlformats.org/drawingml/2006/picture">
                 <pic:pic xmlns:pic="http://schemas.openxmlformats.org/drawingml/2006/picture">
                   <pic:nvPicPr>
-                    <pic:cNvPr id="0" name="Picture 11" descr="C:\Users\user\Downloads\Riwayat Transaksi Page.png"/>
+                    <pic:cNvPr id="0" name="Picture 8"/>
                     <pic:cNvPicPr>
                       <a:picLocks noChangeAspect="1" noChangeArrowheads="1"/>
                     </pic:cNvPicPr>
@@ -35659,7 +35478,7 @@
                   <pic:spPr bwMode="auto">
                     <a:xfrm>
                       <a:off x="0" y="0"/>
-                      <a:ext cx="5038725" cy="3171825"/>
+                      <a:ext cx="5041900" cy="3175000"/>
                     </a:xfrm>
                     <a:prstGeom prst="rect">
                       <a:avLst/>
@@ -35683,11 +35502,11 @@
         <w:rPr>
           <w:b/>
           <w:i w:val="0"/>
+          <w:color w:val="auto"/>
           <w:sz w:val="24"/>
           <w:szCs w:val="24"/>
         </w:rPr>
       </w:pPr>
-      <w:bookmarkStart w:id="91" w:name="_Toc236356535"/>
       <w:r>
         <w:rPr>
           <w:b/>
@@ -35757,9 +35576,371 @@
           <w:sz w:val="24"/>
           <w:szCs w:val="24"/>
         </w:rPr>
+        <w:t xml:space="preserve"> Halaman Ajukan Pengadaan</w:t>
+      </w:r>
+    </w:p>
+    <w:p>
+      <w:pPr>
+        <w:spacing w:line="360" w:lineRule="auto"/>
+        <w:ind w:firstLine="567"/>
+      </w:pPr>
+      <w:r>
+        <w:t>Halaman Ajukan Pengadaan</w:t>
+      </w:r>
+      <w:r>
+        <w:t xml:space="preserve"> pada Gambar 4.13</w:t>
+      </w:r>
+      <w:r>
+        <w:t xml:space="preserve"> dirancang untuk menggambarkan proses pengajuan kebutuhan material ketika stok berada pada kondisi menipis atau habis. Halaman ini menyediakan form untuk menentukan nama material, jumlah material yang akan dipesan, supplier, tanggal pemesanan, dan estimasi kedatangan.</w:t>
+      </w:r>
+    </w:p>
+    <w:p>
+      <w:pPr>
+        <w:spacing w:line="360" w:lineRule="auto"/>
+        <w:ind w:firstLine="567"/>
+      </w:pPr>
+      <w:r>
+        <w:t>Pemilihan nama material dan supplier menggunakan komponen dropdown untuk mempermudah pengguna dalam menentukan data yang tersedia. Sementara itu, informasi jumlah material serta tanggal pemesanan dan estimasi kedatangan disediakan melalui kolom input. Terdapat tombol Ajukan Pengadaan sebagai aksi utama untuk menggambarkan proses pengajuan dan tombol Batal untuk membatalkan pengisian form.</w:t>
+      </w:r>
+    </w:p>
+    <w:p>
+      <w:pPr>
+        <w:spacing w:line="360" w:lineRule="auto"/>
+        <w:ind w:firstLine="567"/>
+      </w:pPr>
+      <w:r>
+        <w:t>Halaman ini masih berupa prototype perancangan antarmuka yang digunakan untuk menggambarkan struktur form dan alur pengajuan pengadaan. Proses pengiriman pengajuan, penyimpanan data, komunikasi dengan supplier, serta perubahan status pengadaan belum diimplementasikan pada tahap prototype.</w:t>
+      </w:r>
+    </w:p>
+    <w:p>
+      <w:pPr>
+        <w:keepNext/>
+        <w:spacing w:line="360" w:lineRule="auto"/>
+      </w:pPr>
+      <w:r>
+        <w:rPr>
+          <w:noProof/>
+        </w:rPr>
+        <w:lastRenderedPageBreak/>
+        <w:drawing>
+          <wp:inline distT="0" distB="0" distL="0" distR="0" wp14:anchorId="4848AA28" wp14:editId="502512B1">
+            <wp:extent cx="5041900" cy="3175000"/>
+            <wp:effectExtent l="0" t="0" r="6350" b="6350"/>
+            <wp:docPr id="20" name="Picture 20"/>
+            <wp:cNvGraphicFramePr>
+              <a:graphicFrameLocks xmlns:a="http://schemas.openxmlformats.org/drawingml/2006/main" noChangeAspect="1"/>
+            </wp:cNvGraphicFramePr>
+            <a:graphic xmlns:a="http://schemas.openxmlformats.org/drawingml/2006/main">
+              <a:graphicData uri="http://schemas.openxmlformats.org/drawingml/2006/picture">
+                <pic:pic xmlns:pic="http://schemas.openxmlformats.org/drawingml/2006/picture">
+                  <pic:nvPicPr>
+                    <pic:cNvPr id="0" name="Picture 9"/>
+                    <pic:cNvPicPr>
+                      <a:picLocks noChangeAspect="1" noChangeArrowheads="1"/>
+                    </pic:cNvPicPr>
+                  </pic:nvPicPr>
+                  <pic:blipFill>
+                    <a:blip r:embed="rId33" cstate="print">
+                      <a:extLst>
+                        <a:ext uri="{28A0092B-C50C-407E-A947-70E740481C1C}">
+                          <a14:useLocalDpi xmlns:a14="http://schemas.microsoft.com/office/drawing/2010/main" val="0"/>
+                        </a:ext>
+                      </a:extLst>
+                    </a:blip>
+                    <a:srcRect/>
+                    <a:stretch>
+                      <a:fillRect/>
+                    </a:stretch>
+                  </pic:blipFill>
+                  <pic:spPr bwMode="auto">
+                    <a:xfrm>
+                      <a:off x="0" y="0"/>
+                      <a:ext cx="5041900" cy="3175000"/>
+                    </a:xfrm>
+                    <a:prstGeom prst="rect">
+                      <a:avLst/>
+                    </a:prstGeom>
+                    <a:noFill/>
+                    <a:ln>
+                      <a:noFill/>
+                    </a:ln>
+                  </pic:spPr>
+                </pic:pic>
+              </a:graphicData>
+            </a:graphic>
+          </wp:inline>
+        </w:drawing>
+      </w:r>
+    </w:p>
+    <w:p>
+      <w:pPr>
+        <w:pStyle w:val="Caption"/>
+        <w:jc w:val="center"/>
+        <w:rPr>
+          <w:b/>
+          <w:i w:val="0"/>
+          <w:color w:val="auto"/>
+          <w:sz w:val="24"/>
+          <w:szCs w:val="24"/>
+        </w:rPr>
+      </w:pPr>
+      <w:r>
+        <w:rPr>
+          <w:b/>
+          <w:i w:val="0"/>
+          <w:color w:val="auto"/>
+          <w:sz w:val="24"/>
+          <w:szCs w:val="24"/>
+        </w:rPr>
+        <w:t xml:space="preserve">Gambar 4. </w:t>
+      </w:r>
+      <w:r>
+        <w:rPr>
+          <w:b/>
+          <w:i w:val="0"/>
+          <w:color w:val="auto"/>
+          <w:sz w:val="24"/>
+          <w:szCs w:val="24"/>
+        </w:rPr>
+        <w:fldChar w:fldCharType="begin"/>
+      </w:r>
+      <w:r>
+        <w:rPr>
+          <w:b/>
+          <w:i w:val="0"/>
+          <w:color w:val="auto"/>
+          <w:sz w:val="24"/>
+          <w:szCs w:val="24"/>
+        </w:rPr>
+        <w:instrText xml:space="preserve"> SEQ Gambar_4. \* ARABIC </w:instrText>
+      </w:r>
+      <w:r>
+        <w:rPr>
+          <w:b/>
+          <w:i w:val="0"/>
+          <w:color w:val="auto"/>
+          <w:sz w:val="24"/>
+          <w:szCs w:val="24"/>
+        </w:rPr>
+        <w:fldChar w:fldCharType="separate"/>
+      </w:r>
+      <w:r>
+        <w:rPr>
+          <w:b/>
+          <w:i w:val="0"/>
+          <w:noProof/>
+          <w:color w:val="auto"/>
+          <w:sz w:val="24"/>
+          <w:szCs w:val="24"/>
+        </w:rPr>
+        <w:t>14</w:t>
+      </w:r>
+      <w:r>
+        <w:rPr>
+          <w:b/>
+          <w:i w:val="0"/>
+          <w:color w:val="auto"/>
+          <w:sz w:val="24"/>
+          <w:szCs w:val="24"/>
+        </w:rPr>
+        <w:fldChar w:fldCharType="end"/>
+      </w:r>
+      <w:r>
+        <w:rPr>
+          <w:b/>
+          <w:i w:val="0"/>
+          <w:color w:val="auto"/>
+          <w:sz w:val="24"/>
+          <w:szCs w:val="24"/>
+        </w:rPr>
+        <w:t xml:space="preserve"> Halaman Persetujuan Pengadaan</w:t>
+      </w:r>
+    </w:p>
+    <w:p>
+      <w:pPr>
+        <w:spacing w:line="360" w:lineRule="auto"/>
+        <w:ind w:firstLine="567"/>
+      </w:pPr>
+      <w:r>
+        <w:t>Halaman Persetujuan Pengadaan</w:t>
+      </w:r>
+      <w:r>
+        <w:t xml:space="preserve"> pada Gambar 4.14</w:t>
+      </w:r>
+      <w:r>
+        <w:t xml:space="preserve"> dirancang untuk menggambarkan proses peninjauan dan pemberian keputusan terhadap pengajuan pengadaan material. Halaman ini menyediakan ringkasan jumlah pengajuan berdasarkan status, yaitu total pengajuan, menunggu, disetujui, dan ditolak.</w:t>
+      </w:r>
+    </w:p>
+    <w:p>
+      <w:pPr>
+        <w:spacing w:line="360" w:lineRule="auto"/>
+        <w:ind w:firstLine="567"/>
+      </w:pPr>
+      <w:r>
+        <w:t>Pada bagian utama terdapat tabel yang menampilkan informasi ID, material, jumlah, supplier, tanggal pengajuan, estimasi kedatangan, dan status pengajuan. Pengguna dapat menggunakan fitur pencarian dan filter status untuk mempermudah dalam menemukan pengajuan tertentu.</w:t>
+      </w:r>
+    </w:p>
+    <w:p>
+      <w:pPr>
+        <w:spacing w:line="360" w:lineRule="auto"/>
+        <w:ind w:firstLine="567"/>
+      </w:pPr>
+      <w:r>
+        <w:t>Untuk pengajuan dengan status Menunggu, tersedia tombol Setujui dan Tolak sebagai gambaran interaksi dalam proses pemberian keputusan. Pengajuan yang telah diproses hanya menampilkan status Disetujui atau Ditolak sebagai informasi hasil keputusan.</w:t>
+      </w:r>
+    </w:p>
+    <w:p>
+      <w:pPr>
+        <w:spacing w:line="360" w:lineRule="auto"/>
+        <w:ind w:firstLine="567"/>
+      </w:pPr>
+      <w:r>
+        <w:t>Halaman ini masih berupa prototype perancangan antarmuka yang digunakan untuk menggambarkan struktur informasi dan alur interaksi proses persetujuan pengadaan. Proses persetujuan secara nyata, perubahan status, penyimpanan keputusan, dan integrasi database belum diimplementasikan pada tahap prototype.</w:t>
+      </w:r>
+    </w:p>
+    <w:p>
+      <w:pPr>
+        <w:keepNext/>
+        <w:spacing w:line="360" w:lineRule="auto"/>
+      </w:pPr>
+      <w:r>
+        <w:rPr>
+          <w:noProof/>
+        </w:rPr>
+        <w:lastRenderedPageBreak/>
+        <w:drawing>
+          <wp:inline distT="0" distB="0" distL="0" distR="0" wp14:anchorId="69D149DF" wp14:editId="2F0260A5">
+            <wp:extent cx="5041900" cy="3175000"/>
+            <wp:effectExtent l="0" t="0" r="6350" b="6350"/>
+            <wp:docPr id="22" name="Picture 22"/>
+            <wp:cNvGraphicFramePr>
+              <a:graphicFrameLocks xmlns:a="http://schemas.openxmlformats.org/drawingml/2006/main" noChangeAspect="1"/>
+            </wp:cNvGraphicFramePr>
+            <a:graphic xmlns:a="http://schemas.openxmlformats.org/drawingml/2006/main">
+              <a:graphicData uri="http://schemas.openxmlformats.org/drawingml/2006/picture">
+                <pic:pic xmlns:pic="http://schemas.openxmlformats.org/drawingml/2006/picture">
+                  <pic:nvPicPr>
+                    <pic:cNvPr id="0" name="Picture 10"/>
+                    <pic:cNvPicPr>
+                      <a:picLocks noChangeAspect="1" noChangeArrowheads="1"/>
+                    </pic:cNvPicPr>
+                  </pic:nvPicPr>
+                  <pic:blipFill>
+                    <a:blip r:embed="rId34" cstate="print">
+                      <a:extLst>
+                        <a:ext uri="{28A0092B-C50C-407E-A947-70E740481C1C}">
+                          <a14:useLocalDpi xmlns:a14="http://schemas.microsoft.com/office/drawing/2010/main" val="0"/>
+                        </a:ext>
+                      </a:extLst>
+                    </a:blip>
+                    <a:srcRect/>
+                    <a:stretch>
+                      <a:fillRect/>
+                    </a:stretch>
+                  </pic:blipFill>
+                  <pic:spPr bwMode="auto">
+                    <a:xfrm>
+                      <a:off x="0" y="0"/>
+                      <a:ext cx="5041900" cy="3175000"/>
+                    </a:xfrm>
+                    <a:prstGeom prst="rect">
+                      <a:avLst/>
+                    </a:prstGeom>
+                    <a:noFill/>
+                    <a:ln>
+                      <a:noFill/>
+                    </a:ln>
+                  </pic:spPr>
+                </pic:pic>
+              </a:graphicData>
+            </a:graphic>
+          </wp:inline>
+        </w:drawing>
+      </w:r>
+    </w:p>
+    <w:p>
+      <w:pPr>
+        <w:pStyle w:val="Caption"/>
+        <w:jc w:val="center"/>
+        <w:rPr>
+          <w:b/>
+          <w:i w:val="0"/>
+          <w:color w:val="auto"/>
+          <w:sz w:val="24"/>
+          <w:szCs w:val="24"/>
+        </w:rPr>
+      </w:pPr>
+      <w:r>
+        <w:rPr>
+          <w:b/>
+          <w:i w:val="0"/>
+          <w:color w:val="auto"/>
+          <w:sz w:val="24"/>
+          <w:szCs w:val="24"/>
+        </w:rPr>
+        <w:t xml:space="preserve">Gambar 4. </w:t>
+      </w:r>
+      <w:r>
+        <w:rPr>
+          <w:b/>
+          <w:i w:val="0"/>
+          <w:color w:val="auto"/>
+          <w:sz w:val="24"/>
+          <w:szCs w:val="24"/>
+        </w:rPr>
+        <w:fldChar w:fldCharType="begin"/>
+      </w:r>
+      <w:r>
+        <w:rPr>
+          <w:b/>
+          <w:i w:val="0"/>
+          <w:color w:val="auto"/>
+          <w:sz w:val="24"/>
+          <w:szCs w:val="24"/>
+        </w:rPr>
+        <w:instrText xml:space="preserve"> SEQ Gambar_4. \* ARABIC </w:instrText>
+      </w:r>
+      <w:r>
+        <w:rPr>
+          <w:b/>
+          <w:i w:val="0"/>
+          <w:color w:val="auto"/>
+          <w:sz w:val="24"/>
+          <w:szCs w:val="24"/>
+        </w:rPr>
+        <w:fldChar w:fldCharType="separate"/>
+      </w:r>
+      <w:r>
+        <w:rPr>
+          <w:b/>
+          <w:i w:val="0"/>
+          <w:noProof/>
+          <w:color w:val="auto"/>
+          <w:sz w:val="24"/>
+          <w:szCs w:val="24"/>
+        </w:rPr>
+        <w:t>15</w:t>
+      </w:r>
+      <w:r>
+        <w:rPr>
+          <w:b/>
+          <w:i w:val="0"/>
+          <w:color w:val="auto"/>
+          <w:sz w:val="24"/>
+          <w:szCs w:val="24"/>
+        </w:rPr>
+        <w:fldChar w:fldCharType="end"/>
+      </w:r>
+      <w:r>
+        <w:rPr>
+          <w:b/>
+          <w:i w:val="0"/>
+          <w:color w:val="auto"/>
+          <w:sz w:val="24"/>
+          <w:szCs w:val="24"/>
+        </w:rPr>
         <w:t xml:space="preserve"> Halaman Riwayat Transaksi</w:t>
       </w:r>
-      <w:bookmarkEnd w:id="91"/>
     </w:p>
     <w:p>
       <w:pPr>
@@ -35767,115 +35948,61 @@
         <w:ind w:firstLine="567"/>
       </w:pPr>
       <w:r>
-        <w:t xml:space="preserve">Halaman Riwayat Transaksi pada Gambar 4.13 berfungsi sebagai media untuk menampilkan seluruh riwayat aktivitas yang berkaitan dengan pengelolaan material, mulai dari proses pengadaan, penerimaan material, hingga pengeluaran stok. Halaman ini dirancang untuk menyediakan dokumentasi transaksi yang </w:t>
-      </w:r>
+        <w:t xml:space="preserve">Halaman Riwayat Transaksi </w:t>
+      </w:r>
+      <w:r>
+        <w:t xml:space="preserve">pada Gambar 4.15 </w:t>
+      </w:r>
+      <w:r>
+        <w:t>dirancang untuk menampilkan dan memantau seluruh aktivitas transaksi yang berkaitan dengan pengadaan, penerimaan material, dan pengeluaran stok. Halaman ini menyediakan ringkasan berupa jumlah total transaksi, pengadaan, penerimaan material, dan pengeluaran stok.</w:t>
+      </w:r>
+    </w:p>
+    <w:p>
+      <w:pPr>
+        <w:spacing w:line="360" w:lineRule="auto"/>
+        <w:ind w:firstLine="567"/>
+      </w:pPr>
+      <w:r>
+        <w:t>Pada bagian utama terdapat tabel riwayat transaksi yang menampilkan nomor transaksi, jenis transaksi, material, jumlah, supplier/tujuan, tanggal, dan status transaksi. Jenis transaksi dibedakan menjadi Pengadaan, Penerimaan, dan Pengeluaran, sedangkan status digunakan untuk menunjukkan kondisi proses transaksi, seperti Diproses dan Selesai.</w:t>
+      </w:r>
+    </w:p>
+    <w:p>
+      <w:pPr>
+        <w:spacing w:line="360" w:lineRule="auto"/>
+        <w:ind w:firstLine="567"/>
+      </w:pPr>
+      <w:r>
+        <w:t>Prototype juga menyediakan fitur pencarian berdasarkan material, supplier, atau nomor transaksi serta filter status untuk mempermudah pengguna dalam menemukan riwayat tertentu. Pada setiap data tersedia tombol Detail untuk menggambarkan akses terhadap informasi transaksi secara lebih lengkap, serta navigasi halaman (pagination) untuk menampilkan data dalam jumlah lebih banyak.</w:t>
+      </w:r>
+    </w:p>
+    <w:p>
+      <w:pPr>
+        <w:spacing w:line="360" w:lineRule="auto"/>
+        <w:ind w:firstLine="567"/>
+      </w:pPr>
+      <w:r>
+        <w:t>Halaman ini masih berupa prototype perancangan antarmuka yang digunakan untuk menggambarkan struktur informasi dan alur interaksi riwayat transaksi. Data transaksi, proses pencatatan otomatis, penyimpanan riwayat, dan integrasi database belum diimplementasikan pada tahap prototype.</w:t>
+      </w:r>
+    </w:p>
+    <w:p>
+      <w:pPr>
+        <w:pStyle w:val="Heading3"/>
+        <w:numPr>
+          <w:ilvl w:val="0"/>
+          <w:numId w:val="57"/>
+        </w:numPr>
+        <w:spacing w:line="360" w:lineRule="auto"/>
+        <w:ind w:left="567" w:hanging="567"/>
+      </w:pPr>
       <w:r>
         <w:lastRenderedPageBreak/>
-        <w:t>tersimpan secara terpusat sehingga setiap aktivitas material dapat ditelusuri kembali dengan mudah.</w:t>
-      </w:r>
-    </w:p>
-    <w:p>
-      <w:pPr>
-        <w:spacing w:line="360" w:lineRule="auto"/>
-        <w:ind w:firstLine="567"/>
-      </w:pPr>
-      <w:r>
-        <w:t>Pada bagian atas halaman ditampilkan beberapa kartu informasi (</w:t>
-      </w:r>
-      <w:r>
-        <w:rPr>
-          <w:i/>
-        </w:rPr>
-        <w:t>summary cards</w:t>
-      </w:r>
-      <w:r>
-        <w:t>) yang menyajikan ringkasan jumlah Total Transaksi, Pengadaan, Penerimaan Material, dan Pengeluaran Stok. Informasi tersebut memberikan gambaran mengenai aktivitas transaksi yang telah terjadi sehingga pengguna dapat memantau kondisi operasional secara lebih cepat.</w:t>
-      </w:r>
-    </w:p>
-    <w:p>
-      <w:pPr>
-        <w:spacing w:line="360" w:lineRule="auto"/>
-        <w:ind w:firstLine="567"/>
-      </w:pPr>
-      <w:r>
-        <w:t xml:space="preserve">Data transaksi ditampilkan dalam bentuk tabel yang memuat informasi berupa nomor transaksi, jenis transaksi, nama material, jumlah material, </w:t>
-      </w:r>
-      <w:r>
-        <w:rPr>
-          <w:i/>
-        </w:rPr>
-        <w:t>supplier</w:t>
-      </w:r>
-      <w:r>
-        <w:t xml:space="preserve"> atau tujuan, tanggal transaksi, status, serta aksi. Pada kolom Jenis Transaksi, sistem membedakan aktivitas menjadi Pengadaan, Penerimaan Material, dan Pengeluaran sehingga pengguna dapat dengan mudah mengetahui jenis aktivitas yang telah dilakukan. Sementara itu, kolom Aksi menyediakan tombol Detail yang digunakan untuk melihat informasi transaksi secara lebih lengkap.</w:t>
-      </w:r>
-    </w:p>
-    <w:p>
-      <w:pPr>
-        <w:spacing w:line="360" w:lineRule="auto"/>
-        <w:ind w:firstLine="567"/>
-      </w:pPr>
-      <w:r>
-        <w:t>Dengan adanya halaman Riwayat Transaksi, seluruh aktivitas pengelolaan material dapat terdokumentasi secara sistematis dan mudah ditelusuri kembali. Halaman ini mendukung proses monitoring, pelaporan, serta evaluasi terhadap aktivitas stok dan pengadaan material di King Aluminium Malang sehingga pengelolaan data menjadi lebih terorganisir dan transparan.</w:t>
-      </w:r>
-    </w:p>
-    <w:p>
-      <w:pPr>
-        <w:spacing w:line="360" w:lineRule="auto"/>
-        <w:ind w:firstLine="567"/>
-      </w:pPr>
-      <w:r>
-        <w:t xml:space="preserve">Berdasarkan hasil implementasi tersebut, seluruh kebutuhan fungsional yang telah diidentifikasi pada tahap </w:t>
-      </w:r>
-      <w:r>
-        <w:rPr>
-          <w:i/>
-        </w:rPr>
-        <w:t>Requirements</w:t>
-      </w:r>
-      <w:r>
-        <w:t xml:space="preserve"> berhasil direpresentasikan ke dalam </w:t>
-      </w:r>
-      <w:r>
-        <w:rPr>
-          <w:i/>
-        </w:rPr>
-        <w:t>prototype</w:t>
-      </w:r>
-      <w:r>
-        <w:t xml:space="preserve"> interaktif menggunakan </w:t>
-      </w:r>
-      <w:r>
-        <w:rPr>
-          <w:i/>
-        </w:rPr>
-        <w:t>Figma</w:t>
-      </w:r>
-      <w:r>
-        <w:t xml:space="preserve">. Prototype ini selanjutnya digunakan sebagai media pengujian pada tahap </w:t>
-      </w:r>
-      <w:r>
-        <w:rPr>
-          <w:i/>
-        </w:rPr>
         <w:t>System Testing</w:t>
       </w:r>
-      <w:r>
-        <w:t xml:space="preserve"> menggunakan </w:t>
-      </w:r>
-      <w:r>
-        <w:rPr>
-          <w:i/>
-        </w:rPr>
-        <w:t>platform Maze</w:t>
-      </w:r>
-      <w:r>
-        <w:t xml:space="preserve"> untuk mengevaluasi kemudahan penggunaan dan tingkat penerimaan pengguna terhadap model sistem yang dikembangkan.</w:t>
-      </w:r>
-    </w:p>
-    <w:p>
-      <w:pPr>
-        <w:spacing w:line="360" w:lineRule="auto"/>
+    </w:p>
+    <w:p>
+      <w:pPr>
+        <w:spacing w:line="360" w:lineRule="auto"/>
+        <w:ind w:left="567"/>
       </w:pPr>
     </w:p>
     <w:p>
@@ -35890,12 +36017,12 @@
       <w:pPr>
         <w:pStyle w:val="Heading1"/>
       </w:pPr>
-      <w:bookmarkStart w:id="92" w:name="_Toc236773802"/>
+      <w:bookmarkStart w:id="87" w:name="_Toc236773802"/>
       <w:r>
         <w:lastRenderedPageBreak/>
         <w:t>DAFTAR PUSTAKA</w:t>
       </w:r>
-      <w:bookmarkEnd w:id="92"/>
+      <w:bookmarkEnd w:id="87"/>
     </w:p>
     <w:p>
       <w:pPr>
@@ -36261,7 +36388,7 @@
       </w:r>
     </w:p>
     <w:sectPr>
-      <w:footerReference w:type="first" r:id="rId33"/>
+      <w:footerReference w:type="first" r:id="rId35"/>
       <w:pgSz w:w="11906" w:h="16838" w:code="9"/>
       <w:pgMar w:top="1701" w:right="1701" w:bottom="1701" w:left="2268" w:header="720" w:footer="720" w:gutter="0"/>
       <w:pgNumType w:start="1"/>
@@ -36909,6 +37036,95 @@
     </w:lvl>
   </w:abstractNum>
   <w:abstractNum w:abstractNumId="3" w15:restartNumberingAfterBreak="0">
+    <w:nsid w:val="05577AD6"/>
+    <w:multiLevelType w:val="hybridMultilevel"/>
+    <w:tmpl w:val="4BF8D356"/>
+    <w:lvl w:ilvl="0" w:tplc="5C4C24A4">
+      <w:start w:val="6"/>
+      <w:numFmt w:val="decimal"/>
+      <w:lvlText w:val="4.3.%1"/>
+      <w:lvlJc w:val="left"/>
+      <w:pPr>
+        <w:ind w:left="720" w:hanging="360"/>
+      </w:pPr>
+      <w:rPr>
+        <w:rFonts w:hint="default"/>
+      </w:rPr>
+    </w:lvl>
+    <w:lvl w:ilvl="1" w:tplc="38090019" w:tentative="1">
+      <w:start w:val="1"/>
+      <w:numFmt w:val="lowerLetter"/>
+      <w:lvlText w:val="%2."/>
+      <w:lvlJc w:val="left"/>
+      <w:pPr>
+        <w:ind w:left="1440" w:hanging="360"/>
+      </w:pPr>
+    </w:lvl>
+    <w:lvl w:ilvl="2" w:tplc="3809001B" w:tentative="1">
+      <w:start w:val="1"/>
+      <w:numFmt w:val="lowerRoman"/>
+      <w:lvlText w:val="%3."/>
+      <w:lvlJc w:val="right"/>
+      <w:pPr>
+        <w:ind w:left="2160" w:hanging="180"/>
+      </w:pPr>
+    </w:lvl>
+    <w:lvl w:ilvl="3" w:tplc="3809000F" w:tentative="1">
+      <w:start w:val="1"/>
+      <w:numFmt w:val="decimal"/>
+      <w:lvlText w:val="%4."/>
+      <w:lvlJc w:val="left"/>
+      <w:pPr>
+        <w:ind w:left="2880" w:hanging="360"/>
+      </w:pPr>
+    </w:lvl>
+    <w:lvl w:ilvl="4" w:tplc="38090019" w:tentative="1">
+      <w:start w:val="1"/>
+      <w:numFmt w:val="lowerLetter"/>
+      <w:lvlText w:val="%5."/>
+      <w:lvlJc w:val="left"/>
+      <w:pPr>
+        <w:ind w:left="3600" w:hanging="360"/>
+      </w:pPr>
+    </w:lvl>
+    <w:lvl w:ilvl="5" w:tplc="3809001B" w:tentative="1">
+      <w:start w:val="1"/>
+      <w:numFmt w:val="lowerRoman"/>
+      <w:lvlText w:val="%6."/>
+      <w:lvlJc w:val="right"/>
+      <w:pPr>
+        <w:ind w:left="4320" w:hanging="180"/>
+      </w:pPr>
+    </w:lvl>
+    <w:lvl w:ilvl="6" w:tplc="3809000F" w:tentative="1">
+      <w:start w:val="1"/>
+      <w:numFmt w:val="decimal"/>
+      <w:lvlText w:val="%7."/>
+      <w:lvlJc w:val="left"/>
+      <w:pPr>
+        <w:ind w:left="5040" w:hanging="360"/>
+      </w:pPr>
+    </w:lvl>
+    <w:lvl w:ilvl="7" w:tplc="38090019" w:tentative="1">
+      <w:start w:val="1"/>
+      <w:numFmt w:val="lowerLetter"/>
+      <w:lvlText w:val="%8."/>
+      <w:lvlJc w:val="left"/>
+      <w:pPr>
+        <w:ind w:left="5760" w:hanging="360"/>
+      </w:pPr>
+    </w:lvl>
+    <w:lvl w:ilvl="8" w:tplc="3809001B" w:tentative="1">
+      <w:start w:val="1"/>
+      <w:numFmt w:val="lowerRoman"/>
+      <w:lvlText w:val="%9."/>
+      <w:lvlJc w:val="right"/>
+      <w:pPr>
+        <w:ind w:left="6480" w:hanging="180"/>
+      </w:pPr>
+    </w:lvl>
+  </w:abstractNum>
+  <w:abstractNum w:abstractNumId="4" w15:restartNumberingAfterBreak="0">
     <w:nsid w:val="0594218C"/>
     <w:multiLevelType w:val="hybridMultilevel"/>
     <w:tmpl w:val="68C0F60C"/>
@@ -36994,7 +37210,7 @@
       </w:pPr>
     </w:lvl>
   </w:abstractNum>
-  <w:abstractNum w:abstractNumId="4" w15:restartNumberingAfterBreak="0">
+  <w:abstractNum w:abstractNumId="5" w15:restartNumberingAfterBreak="0">
     <w:nsid w:val="05CB66CE"/>
     <w:multiLevelType w:val="hybridMultilevel"/>
     <w:tmpl w:val="51A24BEE"/>
@@ -37080,7 +37296,7 @@
       </w:pPr>
     </w:lvl>
   </w:abstractNum>
-  <w:abstractNum w:abstractNumId="5" w15:restartNumberingAfterBreak="0">
+  <w:abstractNum w:abstractNumId="6" w15:restartNumberingAfterBreak="0">
     <w:nsid w:val="075213C0"/>
     <w:multiLevelType w:val="hybridMultilevel"/>
     <w:tmpl w:val="0C545BC2"/>
@@ -37166,7 +37382,7 @@
       </w:pPr>
     </w:lvl>
   </w:abstractNum>
-  <w:abstractNum w:abstractNumId="6" w15:restartNumberingAfterBreak="0">
+  <w:abstractNum w:abstractNumId="7" w15:restartNumberingAfterBreak="0">
     <w:nsid w:val="09A10C08"/>
     <w:multiLevelType w:val="hybridMultilevel"/>
     <w:tmpl w:val="2C5899B2"/>
@@ -37252,7 +37468,7 @@
       </w:pPr>
     </w:lvl>
   </w:abstractNum>
-  <w:abstractNum w:abstractNumId="7" w15:restartNumberingAfterBreak="0">
+  <w:abstractNum w:abstractNumId="8" w15:restartNumberingAfterBreak="0">
     <w:nsid w:val="0C9B5867"/>
     <w:multiLevelType w:val="hybridMultilevel"/>
     <w:tmpl w:val="22EE8D7A"/>
@@ -37338,7 +37554,7 @@
       </w:pPr>
     </w:lvl>
   </w:abstractNum>
-  <w:abstractNum w:abstractNumId="8" w15:restartNumberingAfterBreak="0">
+  <w:abstractNum w:abstractNumId="9" w15:restartNumberingAfterBreak="0">
     <w:nsid w:val="0EFC0E6E"/>
     <w:multiLevelType w:val="hybridMultilevel"/>
     <w:tmpl w:val="C2B29B6E"/>
@@ -37424,7 +37640,7 @@
       </w:pPr>
     </w:lvl>
   </w:abstractNum>
-  <w:abstractNum w:abstractNumId="9" w15:restartNumberingAfterBreak="0">
+  <w:abstractNum w:abstractNumId="10" w15:restartNumberingAfterBreak="0">
     <w:nsid w:val="11366E6B"/>
     <w:multiLevelType w:val="hybridMultilevel"/>
     <w:tmpl w:val="26D4F5FA"/>
@@ -37510,7 +37726,7 @@
       </w:pPr>
     </w:lvl>
   </w:abstractNum>
-  <w:abstractNum w:abstractNumId="10" w15:restartNumberingAfterBreak="0">
+  <w:abstractNum w:abstractNumId="11" w15:restartNumberingAfterBreak="0">
     <w:nsid w:val="11494EED"/>
     <w:multiLevelType w:val="hybridMultilevel"/>
     <w:tmpl w:val="33689D72"/>
@@ -37599,7 +37815,7 @@
       </w:pPr>
     </w:lvl>
   </w:abstractNum>
-  <w:abstractNum w:abstractNumId="11" w15:restartNumberingAfterBreak="0">
+  <w:abstractNum w:abstractNumId="12" w15:restartNumberingAfterBreak="0">
     <w:nsid w:val="12463154"/>
     <w:multiLevelType w:val="hybridMultilevel"/>
     <w:tmpl w:val="57D2AE3C"/>
@@ -37685,7 +37901,7 @@
       </w:pPr>
     </w:lvl>
   </w:abstractNum>
-  <w:abstractNum w:abstractNumId="12" w15:restartNumberingAfterBreak="0">
+  <w:abstractNum w:abstractNumId="13" w15:restartNumberingAfterBreak="0">
     <w:nsid w:val="17B54321"/>
     <w:multiLevelType w:val="hybridMultilevel"/>
     <w:tmpl w:val="7474F2E4"/>
@@ -37771,7 +37987,7 @@
       </w:pPr>
     </w:lvl>
   </w:abstractNum>
-  <w:abstractNum w:abstractNumId="13" w15:restartNumberingAfterBreak="0">
+  <w:abstractNum w:abstractNumId="14" w15:restartNumberingAfterBreak="0">
     <w:nsid w:val="1A584884"/>
     <w:multiLevelType w:val="hybridMultilevel"/>
     <w:tmpl w:val="67D4BFB8"/>
@@ -37857,7 +38073,7 @@
       </w:pPr>
     </w:lvl>
   </w:abstractNum>
-  <w:abstractNum w:abstractNumId="14" w15:restartNumberingAfterBreak="0">
+  <w:abstractNum w:abstractNumId="15" w15:restartNumberingAfterBreak="0">
     <w:nsid w:val="1CC976FE"/>
     <w:multiLevelType w:val="hybridMultilevel"/>
     <w:tmpl w:val="8E4A21E0"/>
@@ -37946,7 +38162,7 @@
       </w:pPr>
     </w:lvl>
   </w:abstractNum>
-  <w:abstractNum w:abstractNumId="15" w15:restartNumberingAfterBreak="0">
+  <w:abstractNum w:abstractNumId="16" w15:restartNumberingAfterBreak="0">
     <w:nsid w:val="1F025009"/>
     <w:multiLevelType w:val="hybridMultilevel"/>
     <w:tmpl w:val="70F6F152"/>
@@ -38032,7 +38248,7 @@
       </w:pPr>
     </w:lvl>
   </w:abstractNum>
-  <w:abstractNum w:abstractNumId="16" w15:restartNumberingAfterBreak="0">
+  <w:abstractNum w:abstractNumId="17" w15:restartNumberingAfterBreak="0">
     <w:nsid w:val="25655515"/>
     <w:multiLevelType w:val="hybridMultilevel"/>
     <w:tmpl w:val="6CC2A56A"/>
@@ -38122,7 +38338,7 @@
       </w:pPr>
     </w:lvl>
   </w:abstractNum>
-  <w:abstractNum w:abstractNumId="17" w15:restartNumberingAfterBreak="0">
+  <w:abstractNum w:abstractNumId="18" w15:restartNumberingAfterBreak="0">
     <w:nsid w:val="26F4299A"/>
     <w:multiLevelType w:val="hybridMultilevel"/>
     <w:tmpl w:val="6958B0EC"/>
@@ -38208,7 +38424,7 @@
       </w:pPr>
     </w:lvl>
   </w:abstractNum>
-  <w:abstractNum w:abstractNumId="18" w15:restartNumberingAfterBreak="0">
+  <w:abstractNum w:abstractNumId="19" w15:restartNumberingAfterBreak="0">
     <w:nsid w:val="27047623"/>
     <w:multiLevelType w:val="hybridMultilevel"/>
     <w:tmpl w:val="9BF48D88"/>
@@ -38297,7 +38513,7 @@
       </w:pPr>
     </w:lvl>
   </w:abstractNum>
-  <w:abstractNum w:abstractNumId="19" w15:restartNumberingAfterBreak="0">
+  <w:abstractNum w:abstractNumId="20" w15:restartNumberingAfterBreak="0">
     <w:nsid w:val="277D0F55"/>
     <w:multiLevelType w:val="hybridMultilevel"/>
     <w:tmpl w:val="E0B044B6"/>
@@ -38383,7 +38599,7 @@
       </w:pPr>
     </w:lvl>
   </w:abstractNum>
-  <w:abstractNum w:abstractNumId="20" w15:restartNumberingAfterBreak="0">
+  <w:abstractNum w:abstractNumId="21" w15:restartNumberingAfterBreak="0">
     <w:nsid w:val="29846FD0"/>
     <w:multiLevelType w:val="hybridMultilevel"/>
     <w:tmpl w:val="90B024BC"/>
@@ -38469,7 +38685,7 @@
       </w:pPr>
     </w:lvl>
   </w:abstractNum>
-  <w:abstractNum w:abstractNumId="21" w15:restartNumberingAfterBreak="0">
+  <w:abstractNum w:abstractNumId="22" w15:restartNumberingAfterBreak="0">
     <w:nsid w:val="2B422C1F"/>
     <w:multiLevelType w:val="hybridMultilevel"/>
     <w:tmpl w:val="0632E6A4"/>
@@ -38558,7 +38774,7 @@
       </w:pPr>
     </w:lvl>
   </w:abstractNum>
-  <w:abstractNum w:abstractNumId="22" w15:restartNumberingAfterBreak="0">
+  <w:abstractNum w:abstractNumId="23" w15:restartNumberingAfterBreak="0">
     <w:nsid w:val="2BE77FDC"/>
     <w:multiLevelType w:val="hybridMultilevel"/>
     <w:tmpl w:val="053E9A0E"/>
@@ -38648,7 +38864,7 @@
       </w:pPr>
     </w:lvl>
   </w:abstractNum>
-  <w:abstractNum w:abstractNumId="23" w15:restartNumberingAfterBreak="0">
+  <w:abstractNum w:abstractNumId="24" w15:restartNumberingAfterBreak="0">
     <w:nsid w:val="2E7D216A"/>
     <w:multiLevelType w:val="hybridMultilevel"/>
     <w:tmpl w:val="7D60631C"/>
@@ -38737,7 +38953,7 @@
       </w:pPr>
     </w:lvl>
   </w:abstractNum>
-  <w:abstractNum w:abstractNumId="24" w15:restartNumberingAfterBreak="0">
+  <w:abstractNum w:abstractNumId="25" w15:restartNumberingAfterBreak="0">
     <w:nsid w:val="323E44DA"/>
     <w:multiLevelType w:val="hybridMultilevel"/>
     <w:tmpl w:val="5C7EE776"/>
@@ -38823,7 +39039,7 @@
       </w:pPr>
     </w:lvl>
   </w:abstractNum>
-  <w:abstractNum w:abstractNumId="25" w15:restartNumberingAfterBreak="0">
+  <w:abstractNum w:abstractNumId="26" w15:restartNumberingAfterBreak="0">
     <w:nsid w:val="32621E2A"/>
     <w:multiLevelType w:val="hybridMultilevel"/>
     <w:tmpl w:val="3FD8B4BC"/>
@@ -38909,7 +39125,7 @@
       </w:pPr>
     </w:lvl>
   </w:abstractNum>
-  <w:abstractNum w:abstractNumId="26" w15:restartNumberingAfterBreak="0">
+  <w:abstractNum w:abstractNumId="27" w15:restartNumberingAfterBreak="0">
     <w:nsid w:val="32E81BFA"/>
     <w:multiLevelType w:val="hybridMultilevel"/>
     <w:tmpl w:val="FDAC5F7C"/>
@@ -38998,7 +39214,7 @@
       </w:pPr>
     </w:lvl>
   </w:abstractNum>
-  <w:abstractNum w:abstractNumId="27" w15:restartNumberingAfterBreak="0">
+  <w:abstractNum w:abstractNumId="28" w15:restartNumberingAfterBreak="0">
     <w:nsid w:val="3BF974B6"/>
     <w:multiLevelType w:val="hybridMultilevel"/>
     <w:tmpl w:val="5FBE8832"/>
@@ -39084,7 +39300,96 @@
       </w:pPr>
     </w:lvl>
   </w:abstractNum>
-  <w:abstractNum w:abstractNumId="28" w15:restartNumberingAfterBreak="0">
+  <w:abstractNum w:abstractNumId="29" w15:restartNumberingAfterBreak="0">
+    <w:nsid w:val="3C887042"/>
+    <w:multiLevelType w:val="hybridMultilevel"/>
+    <w:tmpl w:val="B28C219A"/>
+    <w:lvl w:ilvl="0" w:tplc="B6485B7E">
+      <w:start w:val="6"/>
+      <w:numFmt w:val="decimal"/>
+      <w:lvlText w:val="4.3.%1"/>
+      <w:lvlJc w:val="left"/>
+      <w:pPr>
+        <w:ind w:left="720" w:hanging="360"/>
+      </w:pPr>
+      <w:rPr>
+        <w:rFonts w:hint="default"/>
+      </w:rPr>
+    </w:lvl>
+    <w:lvl w:ilvl="1" w:tplc="38090019" w:tentative="1">
+      <w:start w:val="1"/>
+      <w:numFmt w:val="lowerLetter"/>
+      <w:lvlText w:val="%2."/>
+      <w:lvlJc w:val="left"/>
+      <w:pPr>
+        <w:ind w:left="1440" w:hanging="360"/>
+      </w:pPr>
+    </w:lvl>
+    <w:lvl w:ilvl="2" w:tplc="3809001B" w:tentative="1">
+      <w:start w:val="1"/>
+      <w:numFmt w:val="lowerRoman"/>
+      <w:lvlText w:val="%3."/>
+      <w:lvlJc w:val="right"/>
+      <w:pPr>
+        <w:ind w:left="2160" w:hanging="180"/>
+      </w:pPr>
+    </w:lvl>
+    <w:lvl w:ilvl="3" w:tplc="3809000F" w:tentative="1">
+      <w:start w:val="1"/>
+      <w:numFmt w:val="decimal"/>
+      <w:lvlText w:val="%4."/>
+      <w:lvlJc w:val="left"/>
+      <w:pPr>
+        <w:ind w:left="2880" w:hanging="360"/>
+      </w:pPr>
+    </w:lvl>
+    <w:lvl w:ilvl="4" w:tplc="38090019" w:tentative="1">
+      <w:start w:val="1"/>
+      <w:numFmt w:val="lowerLetter"/>
+      <w:lvlText w:val="%5."/>
+      <w:lvlJc w:val="left"/>
+      <w:pPr>
+        <w:ind w:left="3600" w:hanging="360"/>
+      </w:pPr>
+    </w:lvl>
+    <w:lvl w:ilvl="5" w:tplc="3809001B" w:tentative="1">
+      <w:start w:val="1"/>
+      <w:numFmt w:val="lowerRoman"/>
+      <w:lvlText w:val="%6."/>
+      <w:lvlJc w:val="right"/>
+      <w:pPr>
+        <w:ind w:left="4320" w:hanging="180"/>
+      </w:pPr>
+    </w:lvl>
+    <w:lvl w:ilvl="6" w:tplc="3809000F" w:tentative="1">
+      <w:start w:val="1"/>
+      <w:numFmt w:val="decimal"/>
+      <w:lvlText w:val="%7."/>
+      <w:lvlJc w:val="left"/>
+      <w:pPr>
+        <w:ind w:left="5040" w:hanging="360"/>
+      </w:pPr>
+    </w:lvl>
+    <w:lvl w:ilvl="7" w:tplc="38090019" w:tentative="1">
+      <w:start w:val="1"/>
+      <w:numFmt w:val="lowerLetter"/>
+      <w:lvlText w:val="%8."/>
+      <w:lvlJc w:val="left"/>
+      <w:pPr>
+        <w:ind w:left="5760" w:hanging="360"/>
+      </w:pPr>
+    </w:lvl>
+    <w:lvl w:ilvl="8" w:tplc="3809001B" w:tentative="1">
+      <w:start w:val="1"/>
+      <w:numFmt w:val="lowerRoman"/>
+      <w:lvlText w:val="%9."/>
+      <w:lvlJc w:val="right"/>
+      <w:pPr>
+        <w:ind w:left="6480" w:hanging="180"/>
+      </w:pPr>
+    </w:lvl>
+  </w:abstractNum>
+  <w:abstractNum w:abstractNumId="30" w15:restartNumberingAfterBreak="0">
     <w:nsid w:val="3CD045BD"/>
     <w:multiLevelType w:val="hybridMultilevel"/>
     <w:tmpl w:val="395CFC76"/>
@@ -39170,7 +39475,7 @@
       </w:pPr>
     </w:lvl>
   </w:abstractNum>
-  <w:abstractNum w:abstractNumId="29" w15:restartNumberingAfterBreak="0">
+  <w:abstractNum w:abstractNumId="31" w15:restartNumberingAfterBreak="0">
     <w:nsid w:val="3DBA50C8"/>
     <w:multiLevelType w:val="hybridMultilevel"/>
     <w:tmpl w:val="DAB0188E"/>
@@ -39256,7 +39561,7 @@
       </w:pPr>
     </w:lvl>
   </w:abstractNum>
-  <w:abstractNum w:abstractNumId="30" w15:restartNumberingAfterBreak="0">
+  <w:abstractNum w:abstractNumId="32" w15:restartNumberingAfterBreak="0">
     <w:nsid w:val="3F5568E9"/>
     <w:multiLevelType w:val="hybridMultilevel"/>
     <w:tmpl w:val="68C265CC"/>
@@ -39342,7 +39647,7 @@
       </w:pPr>
     </w:lvl>
   </w:abstractNum>
-  <w:abstractNum w:abstractNumId="31" w15:restartNumberingAfterBreak="0">
+  <w:abstractNum w:abstractNumId="33" w15:restartNumberingAfterBreak="0">
     <w:nsid w:val="450E5AB8"/>
     <w:multiLevelType w:val="hybridMultilevel"/>
     <w:tmpl w:val="B02E6DB8"/>
@@ -39428,7 +39733,7 @@
       </w:pPr>
     </w:lvl>
   </w:abstractNum>
-  <w:abstractNum w:abstractNumId="32" w15:restartNumberingAfterBreak="0">
+  <w:abstractNum w:abstractNumId="34" w15:restartNumberingAfterBreak="0">
     <w:nsid w:val="47012EF6"/>
     <w:multiLevelType w:val="hybridMultilevel"/>
     <w:tmpl w:val="9E743C50"/>
@@ -39514,7 +39819,7 @@
       </w:pPr>
     </w:lvl>
   </w:abstractNum>
-  <w:abstractNum w:abstractNumId="33" w15:restartNumberingAfterBreak="0">
+  <w:abstractNum w:abstractNumId="35" w15:restartNumberingAfterBreak="0">
     <w:nsid w:val="47D32FFC"/>
     <w:multiLevelType w:val="hybridMultilevel"/>
     <w:tmpl w:val="1B18BE12"/>
@@ -39604,7 +39909,7 @@
       </w:pPr>
     </w:lvl>
   </w:abstractNum>
-  <w:abstractNum w:abstractNumId="34" w15:restartNumberingAfterBreak="0">
+  <w:abstractNum w:abstractNumId="36" w15:restartNumberingAfterBreak="0">
     <w:nsid w:val="49725454"/>
     <w:multiLevelType w:val="hybridMultilevel"/>
     <w:tmpl w:val="8B303EE4"/>
@@ -39695,7 +40000,7 @@
       </w:pPr>
     </w:lvl>
   </w:abstractNum>
-  <w:abstractNum w:abstractNumId="35" w15:restartNumberingAfterBreak="0">
+  <w:abstractNum w:abstractNumId="37" w15:restartNumberingAfterBreak="0">
     <w:nsid w:val="4B524E88"/>
     <w:multiLevelType w:val="hybridMultilevel"/>
     <w:tmpl w:val="FD3A3B6E"/>
@@ -39781,7 +40086,96 @@
       </w:pPr>
     </w:lvl>
   </w:abstractNum>
-  <w:abstractNum w:abstractNumId="36" w15:restartNumberingAfterBreak="0">
+  <w:abstractNum w:abstractNumId="38" w15:restartNumberingAfterBreak="0">
+    <w:nsid w:val="4DED3BBB"/>
+    <w:multiLevelType w:val="hybridMultilevel"/>
+    <w:tmpl w:val="49162B44"/>
+    <w:lvl w:ilvl="0" w:tplc="ACD6F91E">
+      <w:start w:val="1"/>
+      <w:numFmt w:val="decimal"/>
+      <w:lvlText w:val="4.3.%1"/>
+      <w:lvlJc w:val="left"/>
+      <w:pPr>
+        <w:ind w:left="720" w:hanging="360"/>
+      </w:pPr>
+      <w:rPr>
+        <w:rFonts w:hint="default"/>
+      </w:rPr>
+    </w:lvl>
+    <w:lvl w:ilvl="1" w:tplc="38090019" w:tentative="1">
+      <w:start w:val="1"/>
+      <w:numFmt w:val="lowerLetter"/>
+      <w:lvlText w:val="%2."/>
+      <w:lvlJc w:val="left"/>
+      <w:pPr>
+        <w:ind w:left="1440" w:hanging="360"/>
+      </w:pPr>
+    </w:lvl>
+    <w:lvl w:ilvl="2" w:tplc="3809001B" w:tentative="1">
+      <w:start w:val="1"/>
+      <w:numFmt w:val="lowerRoman"/>
+      <w:lvlText w:val="%3."/>
+      <w:lvlJc w:val="right"/>
+      <w:pPr>
+        <w:ind w:left="2160" w:hanging="180"/>
+      </w:pPr>
+    </w:lvl>
+    <w:lvl w:ilvl="3" w:tplc="3809000F" w:tentative="1">
+      <w:start w:val="1"/>
+      <w:numFmt w:val="decimal"/>
+      <w:lvlText w:val="%4."/>
+      <w:lvlJc w:val="left"/>
+      <w:pPr>
+        <w:ind w:left="2880" w:hanging="360"/>
+      </w:pPr>
+    </w:lvl>
+    <w:lvl w:ilvl="4" w:tplc="38090019" w:tentative="1">
+      <w:start w:val="1"/>
+      <w:numFmt w:val="lowerLetter"/>
+      <w:lvlText w:val="%5."/>
+      <w:lvlJc w:val="left"/>
+      <w:pPr>
+        <w:ind w:left="3600" w:hanging="360"/>
+      </w:pPr>
+    </w:lvl>
+    <w:lvl w:ilvl="5" w:tplc="3809001B" w:tentative="1">
+      <w:start w:val="1"/>
+      <w:numFmt w:val="lowerRoman"/>
+      <w:lvlText w:val="%6."/>
+      <w:lvlJc w:val="right"/>
+      <w:pPr>
+        <w:ind w:left="4320" w:hanging="180"/>
+      </w:pPr>
+    </w:lvl>
+    <w:lvl w:ilvl="6" w:tplc="3809000F" w:tentative="1">
+      <w:start w:val="1"/>
+      <w:numFmt w:val="decimal"/>
+      <w:lvlText w:val="%7."/>
+      <w:lvlJc w:val="left"/>
+      <w:pPr>
+        <w:ind w:left="5040" w:hanging="360"/>
+      </w:pPr>
+    </w:lvl>
+    <w:lvl w:ilvl="7" w:tplc="38090019" w:tentative="1">
+      <w:start w:val="1"/>
+      <w:numFmt w:val="lowerLetter"/>
+      <w:lvlText w:val="%8."/>
+      <w:lvlJc w:val="left"/>
+      <w:pPr>
+        <w:ind w:left="5760" w:hanging="360"/>
+      </w:pPr>
+    </w:lvl>
+    <w:lvl w:ilvl="8" w:tplc="3809001B" w:tentative="1">
+      <w:start w:val="1"/>
+      <w:numFmt w:val="lowerRoman"/>
+      <w:lvlText w:val="%9."/>
+      <w:lvlJc w:val="right"/>
+      <w:pPr>
+        <w:ind w:left="6480" w:hanging="180"/>
+      </w:pPr>
+    </w:lvl>
+  </w:abstractNum>
+  <w:abstractNum w:abstractNumId="39" w15:restartNumberingAfterBreak="0">
     <w:nsid w:val="4F470B14"/>
     <w:multiLevelType w:val="hybridMultilevel"/>
     <w:tmpl w:val="0C9E89A8"/>
@@ -39867,7 +40261,7 @@
       </w:pPr>
     </w:lvl>
   </w:abstractNum>
-  <w:abstractNum w:abstractNumId="37" w15:restartNumberingAfterBreak="0">
+  <w:abstractNum w:abstractNumId="40" w15:restartNumberingAfterBreak="0">
     <w:nsid w:val="51266053"/>
     <w:multiLevelType w:val="hybridMultilevel"/>
     <w:tmpl w:val="531CAD8C"/>
@@ -39953,7 +40347,7 @@
       </w:pPr>
     </w:lvl>
   </w:abstractNum>
-  <w:abstractNum w:abstractNumId="38" w15:restartNumberingAfterBreak="0">
+  <w:abstractNum w:abstractNumId="41" w15:restartNumberingAfterBreak="0">
     <w:nsid w:val="53F36488"/>
     <w:multiLevelType w:val="hybridMultilevel"/>
     <w:tmpl w:val="7C94BC48"/>
@@ -40039,7 +40433,7 @@
       </w:pPr>
     </w:lvl>
   </w:abstractNum>
-  <w:abstractNum w:abstractNumId="39" w15:restartNumberingAfterBreak="0">
+  <w:abstractNum w:abstractNumId="42" w15:restartNumberingAfterBreak="0">
     <w:nsid w:val="54877EBF"/>
     <w:multiLevelType w:val="hybridMultilevel"/>
     <w:tmpl w:val="668C7824"/>
@@ -40129,7 +40523,7 @@
       </w:pPr>
     </w:lvl>
   </w:abstractNum>
-  <w:abstractNum w:abstractNumId="40" w15:restartNumberingAfterBreak="0">
+  <w:abstractNum w:abstractNumId="43" w15:restartNumberingAfterBreak="0">
     <w:nsid w:val="54AA4DEA"/>
     <w:multiLevelType w:val="hybridMultilevel"/>
     <w:tmpl w:val="86468FCE"/>
@@ -40218,7 +40612,7 @@
       </w:pPr>
     </w:lvl>
   </w:abstractNum>
-  <w:abstractNum w:abstractNumId="41" w15:restartNumberingAfterBreak="0">
+  <w:abstractNum w:abstractNumId="44" w15:restartNumberingAfterBreak="0">
     <w:nsid w:val="5CF03077"/>
     <w:multiLevelType w:val="hybridMultilevel"/>
     <w:tmpl w:val="87EA8586"/>
@@ -40307,7 +40701,7 @@
       </w:pPr>
     </w:lvl>
   </w:abstractNum>
-  <w:abstractNum w:abstractNumId="42" w15:restartNumberingAfterBreak="0">
+  <w:abstractNum w:abstractNumId="45" w15:restartNumberingAfterBreak="0">
     <w:nsid w:val="5D263B2C"/>
     <w:multiLevelType w:val="hybridMultilevel"/>
     <w:tmpl w:val="74E02B48"/>
@@ -40396,7 +40790,7 @@
       </w:pPr>
     </w:lvl>
   </w:abstractNum>
-  <w:abstractNum w:abstractNumId="43" w15:restartNumberingAfterBreak="0">
+  <w:abstractNum w:abstractNumId="46" w15:restartNumberingAfterBreak="0">
     <w:nsid w:val="5FFC0394"/>
     <w:multiLevelType w:val="hybridMultilevel"/>
     <w:tmpl w:val="A2F669E4"/>
@@ -40482,7 +40876,96 @@
       </w:pPr>
     </w:lvl>
   </w:abstractNum>
-  <w:abstractNum w:abstractNumId="44" w15:restartNumberingAfterBreak="0">
+  <w:abstractNum w:abstractNumId="47" w15:restartNumberingAfterBreak="0">
+    <w:nsid w:val="60CE0DE1"/>
+    <w:multiLevelType w:val="hybridMultilevel"/>
+    <w:tmpl w:val="3A22AA50"/>
+    <w:lvl w:ilvl="0" w:tplc="ACD6F91E">
+      <w:start w:val="1"/>
+      <w:numFmt w:val="decimal"/>
+      <w:lvlText w:val="4.3.%1"/>
+      <w:lvlJc w:val="left"/>
+      <w:pPr>
+        <w:ind w:left="720" w:hanging="360"/>
+      </w:pPr>
+      <w:rPr>
+        <w:rFonts w:hint="default"/>
+      </w:rPr>
+    </w:lvl>
+    <w:lvl w:ilvl="1" w:tplc="38090019" w:tentative="1">
+      <w:start w:val="1"/>
+      <w:numFmt w:val="lowerLetter"/>
+      <w:lvlText w:val="%2."/>
+      <w:lvlJc w:val="left"/>
+      <w:pPr>
+        <w:ind w:left="1440" w:hanging="360"/>
+      </w:pPr>
+    </w:lvl>
+    <w:lvl w:ilvl="2" w:tplc="3809001B" w:tentative="1">
+      <w:start w:val="1"/>
+      <w:numFmt w:val="lowerRoman"/>
+      <w:lvlText w:val="%3."/>
+      <w:lvlJc w:val="right"/>
+      <w:pPr>
+        <w:ind w:left="2160" w:hanging="180"/>
+      </w:pPr>
+    </w:lvl>
+    <w:lvl w:ilvl="3" w:tplc="3809000F" w:tentative="1">
+      <w:start w:val="1"/>
+      <w:numFmt w:val="decimal"/>
+      <w:lvlText w:val="%4."/>
+      <w:lvlJc w:val="left"/>
+      <w:pPr>
+        <w:ind w:left="2880" w:hanging="360"/>
+      </w:pPr>
+    </w:lvl>
+    <w:lvl w:ilvl="4" w:tplc="38090019" w:tentative="1">
+      <w:start w:val="1"/>
+      <w:numFmt w:val="lowerLetter"/>
+      <w:lvlText w:val="%5."/>
+      <w:lvlJc w:val="left"/>
+      <w:pPr>
+        <w:ind w:left="3600" w:hanging="360"/>
+      </w:pPr>
+    </w:lvl>
+    <w:lvl w:ilvl="5" w:tplc="3809001B" w:tentative="1">
+      <w:start w:val="1"/>
+      <w:numFmt w:val="lowerRoman"/>
+      <w:lvlText w:val="%6."/>
+      <w:lvlJc w:val="right"/>
+      <w:pPr>
+        <w:ind w:left="4320" w:hanging="180"/>
+      </w:pPr>
+    </w:lvl>
+    <w:lvl w:ilvl="6" w:tplc="3809000F" w:tentative="1">
+      <w:start w:val="1"/>
+      <w:numFmt w:val="decimal"/>
+      <w:lvlText w:val="%7."/>
+      <w:lvlJc w:val="left"/>
+      <w:pPr>
+        <w:ind w:left="5040" w:hanging="360"/>
+      </w:pPr>
+    </w:lvl>
+    <w:lvl w:ilvl="7" w:tplc="38090019" w:tentative="1">
+      <w:start w:val="1"/>
+      <w:numFmt w:val="lowerLetter"/>
+      <w:lvlText w:val="%8."/>
+      <w:lvlJc w:val="left"/>
+      <w:pPr>
+        <w:ind w:left="5760" w:hanging="360"/>
+      </w:pPr>
+    </w:lvl>
+    <w:lvl w:ilvl="8" w:tplc="3809001B" w:tentative="1">
+      <w:start w:val="1"/>
+      <w:numFmt w:val="lowerRoman"/>
+      <w:lvlText w:val="%9."/>
+      <w:lvlJc w:val="right"/>
+      <w:pPr>
+        <w:ind w:left="6480" w:hanging="180"/>
+      </w:pPr>
+    </w:lvl>
+  </w:abstractNum>
+  <w:abstractNum w:abstractNumId="48" w15:restartNumberingAfterBreak="0">
     <w:nsid w:val="652B6F3A"/>
     <w:multiLevelType w:val="hybridMultilevel"/>
     <w:tmpl w:val="60120D3E"/>
@@ -40571,7 +41054,7 @@
       </w:pPr>
     </w:lvl>
   </w:abstractNum>
-  <w:abstractNum w:abstractNumId="45" w15:restartNumberingAfterBreak="0">
+  <w:abstractNum w:abstractNumId="49" w15:restartNumberingAfterBreak="0">
     <w:nsid w:val="656E0CAC"/>
     <w:multiLevelType w:val="hybridMultilevel"/>
     <w:tmpl w:val="3BBC0F72"/>
@@ -40657,7 +41140,7 @@
       </w:pPr>
     </w:lvl>
   </w:abstractNum>
-  <w:abstractNum w:abstractNumId="46" w15:restartNumberingAfterBreak="0">
+  <w:abstractNum w:abstractNumId="50" w15:restartNumberingAfterBreak="0">
     <w:nsid w:val="65A37C38"/>
     <w:multiLevelType w:val="hybridMultilevel"/>
     <w:tmpl w:val="06DA52FC"/>
@@ -40749,7 +41232,7 @@
       </w:pPr>
     </w:lvl>
   </w:abstractNum>
-  <w:abstractNum w:abstractNumId="47" w15:restartNumberingAfterBreak="0">
+  <w:abstractNum w:abstractNumId="51" w15:restartNumberingAfterBreak="0">
     <w:nsid w:val="661B5D83"/>
     <w:multiLevelType w:val="hybridMultilevel"/>
     <w:tmpl w:val="3982B156"/>
@@ -40835,7 +41318,7 @@
       </w:pPr>
     </w:lvl>
   </w:abstractNum>
-  <w:abstractNum w:abstractNumId="48" w15:restartNumberingAfterBreak="0">
+  <w:abstractNum w:abstractNumId="52" w15:restartNumberingAfterBreak="0">
     <w:nsid w:val="6B991741"/>
     <w:multiLevelType w:val="hybridMultilevel"/>
     <w:tmpl w:val="3202E766"/>
@@ -40921,7 +41404,7 @@
       </w:pPr>
     </w:lvl>
   </w:abstractNum>
-  <w:abstractNum w:abstractNumId="49" w15:restartNumberingAfterBreak="0">
+  <w:abstractNum w:abstractNumId="53" w15:restartNumberingAfterBreak="0">
     <w:nsid w:val="6BD058A7"/>
     <w:multiLevelType w:val="hybridMultilevel"/>
     <w:tmpl w:val="F774B9E4"/>
@@ -41007,7 +41490,7 @@
       </w:pPr>
     </w:lvl>
   </w:abstractNum>
-  <w:abstractNum w:abstractNumId="50" w15:restartNumberingAfterBreak="0">
+  <w:abstractNum w:abstractNumId="54" w15:restartNumberingAfterBreak="0">
     <w:nsid w:val="6E3D6318"/>
     <w:multiLevelType w:val="hybridMultilevel"/>
     <w:tmpl w:val="D774188E"/>
@@ -41097,7 +41580,7 @@
       </w:pPr>
     </w:lvl>
   </w:abstractNum>
-  <w:abstractNum w:abstractNumId="51" w15:restartNumberingAfterBreak="0">
+  <w:abstractNum w:abstractNumId="55" w15:restartNumberingAfterBreak="0">
     <w:nsid w:val="7AC64A60"/>
     <w:multiLevelType w:val="hybridMultilevel"/>
     <w:tmpl w:val="D69A709A"/>
@@ -41186,7 +41669,7 @@
       </w:pPr>
     </w:lvl>
   </w:abstractNum>
-  <w:abstractNum w:abstractNumId="52" w15:restartNumberingAfterBreak="0">
+  <w:abstractNum w:abstractNumId="56" w15:restartNumberingAfterBreak="0">
     <w:nsid w:val="7F39738D"/>
     <w:multiLevelType w:val="hybridMultilevel"/>
     <w:tmpl w:val="77E27EA8"/>
@@ -41277,163 +41760,175 @@
     </w:lvl>
   </w:abstractNum>
   <w:num w:numId="1">
-    <w:abstractNumId w:val="11"/>
+    <w:abstractNumId w:val="12"/>
   </w:num>
   <w:num w:numId="2">
-    <w:abstractNumId w:val="44"/>
+    <w:abstractNumId w:val="48"/>
   </w:num>
   <w:num w:numId="3">
-    <w:abstractNumId w:val="31"/>
+    <w:abstractNumId w:val="33"/>
   </w:num>
   <w:num w:numId="4">
-    <w:abstractNumId w:val="47"/>
+    <w:abstractNumId w:val="51"/>
   </w:num>
   <w:num w:numId="5">
+    <w:abstractNumId w:val="37"/>
+  </w:num>
+  <w:num w:numId="6">
+    <w:abstractNumId w:val="55"/>
+  </w:num>
+  <w:num w:numId="7">
     <w:abstractNumId w:val="35"/>
   </w:num>
-  <w:num w:numId="6">
-    <w:abstractNumId w:val="51"/>
-  </w:num>
-  <w:num w:numId="7">
-    <w:abstractNumId w:val="33"/>
-  </w:num>
   <w:num w:numId="8">
-    <w:abstractNumId w:val="32"/>
+    <w:abstractNumId w:val="34"/>
   </w:num>
   <w:num w:numId="9">
-    <w:abstractNumId w:val="15"/>
+    <w:abstractNumId w:val="16"/>
   </w:num>
   <w:num w:numId="10">
-    <w:abstractNumId w:val="4"/>
+    <w:abstractNumId w:val="5"/>
   </w:num>
   <w:num w:numId="11">
-    <w:abstractNumId w:val="46"/>
+    <w:abstractNumId w:val="50"/>
   </w:num>
   <w:num w:numId="12">
-    <w:abstractNumId w:val="49"/>
+    <w:abstractNumId w:val="53"/>
   </w:num>
   <w:num w:numId="13">
-    <w:abstractNumId w:val="34"/>
+    <w:abstractNumId w:val="36"/>
   </w:num>
   <w:num w:numId="14">
-    <w:abstractNumId w:val="25"/>
+    <w:abstractNumId w:val="26"/>
   </w:num>
   <w:num w:numId="15">
-    <w:abstractNumId w:val="20"/>
+    <w:abstractNumId w:val="21"/>
   </w:num>
   <w:num w:numId="16">
-    <w:abstractNumId w:val="36"/>
+    <w:abstractNumId w:val="39"/>
   </w:num>
   <w:num w:numId="17">
-    <w:abstractNumId w:val="5"/>
+    <w:abstractNumId w:val="6"/>
   </w:num>
   <w:num w:numId="18">
-    <w:abstractNumId w:val="38"/>
+    <w:abstractNumId w:val="41"/>
   </w:num>
   <w:num w:numId="19">
-    <w:abstractNumId w:val="17"/>
+    <w:abstractNumId w:val="18"/>
   </w:num>
   <w:num w:numId="20">
-    <w:abstractNumId w:val="48"/>
+    <w:abstractNumId w:val="52"/>
   </w:num>
   <w:num w:numId="21">
-    <w:abstractNumId w:val="40"/>
+    <w:abstractNumId w:val="43"/>
   </w:num>
   <w:num w:numId="22">
-    <w:abstractNumId w:val="39"/>
+    <w:abstractNumId w:val="42"/>
   </w:num>
   <w:num w:numId="23">
     <w:abstractNumId w:val="2"/>
   </w:num>
   <w:num w:numId="24">
-    <w:abstractNumId w:val="50"/>
+    <w:abstractNumId w:val="54"/>
   </w:num>
   <w:num w:numId="25">
-    <w:abstractNumId w:val="3"/>
+    <w:abstractNumId w:val="4"/>
   </w:num>
   <w:num w:numId="26">
     <w:abstractNumId w:val="1"/>
   </w:num>
   <w:num w:numId="27">
+    <w:abstractNumId w:val="24"/>
+  </w:num>
+  <w:num w:numId="28">
+    <w:abstractNumId w:val="56"/>
+  </w:num>
+  <w:num w:numId="29">
     <w:abstractNumId w:val="23"/>
   </w:num>
-  <w:num w:numId="28">
-    <w:abstractNumId w:val="52"/>
+  <w:num w:numId="30">
+    <w:abstractNumId w:val="31"/>
   </w:num>
-  <w:num w:numId="29">
+  <w:num w:numId="31">
+    <w:abstractNumId w:val="10"/>
+  </w:num>
+  <w:num w:numId="32">
+    <w:abstractNumId w:val="28"/>
+  </w:num>
+  <w:num w:numId="33">
+    <w:abstractNumId w:val="7"/>
+  </w:num>
+  <w:num w:numId="34">
+    <w:abstractNumId w:val="44"/>
+  </w:num>
+  <w:num w:numId="35">
+    <w:abstractNumId w:val="45"/>
+  </w:num>
+  <w:num w:numId="36">
+    <w:abstractNumId w:val="27"/>
+  </w:num>
+  <w:num w:numId="37">
+    <w:abstractNumId w:val="17"/>
+  </w:num>
+  <w:num w:numId="38">
+    <w:abstractNumId w:val="19"/>
+  </w:num>
+  <w:num w:numId="39">
+    <w:abstractNumId w:val="20"/>
+  </w:num>
+  <w:num w:numId="40">
+    <w:abstractNumId w:val="8"/>
+  </w:num>
+  <w:num w:numId="41">
     <w:abstractNumId w:val="22"/>
   </w:num>
-  <w:num w:numId="30">
-    <w:abstractNumId w:val="29"/>
-  </w:num>
-  <w:num w:numId="31">
+  <w:num w:numId="42">
     <w:abstractNumId w:val="9"/>
   </w:num>
-  <w:num w:numId="32">
-    <w:abstractNumId w:val="27"/>
-  </w:num>
-  <w:num w:numId="33">
-    <w:abstractNumId w:val="6"/>
-  </w:num>
-  <w:num w:numId="34">
-    <w:abstractNumId w:val="41"/>
-  </w:num>
-  <w:num w:numId="35">
-    <w:abstractNumId w:val="42"/>
-  </w:num>
-  <w:num w:numId="36">
-    <w:abstractNumId w:val="26"/>
-  </w:num>
-  <w:num w:numId="37">
-    <w:abstractNumId w:val="16"/>
-  </w:num>
-  <w:num w:numId="38">
-    <w:abstractNumId w:val="18"/>
-  </w:num>
-  <w:num w:numId="39">
-    <w:abstractNumId w:val="19"/>
-  </w:num>
-  <w:num w:numId="40">
-    <w:abstractNumId w:val="7"/>
-  </w:num>
-  <w:num w:numId="41">
-    <w:abstractNumId w:val="21"/>
-  </w:num>
-  <w:num w:numId="42">
-    <w:abstractNumId w:val="8"/>
-  </w:num>
   <w:num w:numId="43">
-    <w:abstractNumId w:val="45"/>
+    <w:abstractNumId w:val="49"/>
   </w:num>
   <w:num w:numId="44">
-    <w:abstractNumId w:val="12"/>
+    <w:abstractNumId w:val="13"/>
   </w:num>
   <w:num w:numId="45">
+    <w:abstractNumId w:val="32"/>
+  </w:num>
+  <w:num w:numId="46">
+    <w:abstractNumId w:val="46"/>
+  </w:num>
+  <w:num w:numId="47">
+    <w:abstractNumId w:val="40"/>
+  </w:num>
+  <w:num w:numId="48">
+    <w:abstractNumId w:val="25"/>
+  </w:num>
+  <w:num w:numId="49">
     <w:abstractNumId w:val="30"/>
   </w:num>
-  <w:num w:numId="46">
-    <w:abstractNumId w:val="43"/>
-  </w:num>
-  <w:num w:numId="47">
-    <w:abstractNumId w:val="37"/>
-  </w:num>
-  <w:num w:numId="48">
-    <w:abstractNumId w:val="24"/>
-  </w:num>
-  <w:num w:numId="49">
-    <w:abstractNumId w:val="28"/>
-  </w:num>
   <w:num w:numId="50">
-    <w:abstractNumId w:val="13"/>
+    <w:abstractNumId w:val="14"/>
   </w:num>
   <w:num w:numId="51">
     <w:abstractNumId w:val="0"/>
   </w:num>
   <w:num w:numId="52">
-    <w:abstractNumId w:val="10"/>
+    <w:abstractNumId w:val="11"/>
   </w:num>
   <w:num w:numId="53">
-    <w:abstractNumId w:val="14"/>
+    <w:abstractNumId w:val="15"/>
+  </w:num>
+  <w:num w:numId="54">
+    <w:abstractNumId w:val="38"/>
+  </w:num>
+  <w:num w:numId="55">
+    <w:abstractNumId w:val="3"/>
+  </w:num>
+  <w:num w:numId="56">
+    <w:abstractNumId w:val="47"/>
+  </w:num>
+  <w:num w:numId="57">
+    <w:abstractNumId w:val="29"/>
   </w:num>
   <w:numIdMacAtCleanup w:val="47"/>
 </w:numbering>
@@ -42569,7 +43064,7 @@
 </file>
 
 <file path=customXml/itemProps1.xml><?xml version="1.0" encoding="utf-8"?>
-<ds:datastoreItem xmlns:ds="http://schemas.openxmlformats.org/officeDocument/2006/customXml" ds:itemID="{4A592834-CE92-4870-89B6-C2AB01349F39}">
+<ds:datastoreItem xmlns:ds="http://schemas.openxmlformats.org/officeDocument/2006/customXml" ds:itemID="{B0706721-D702-4E0D-A4D2-DA6808B61176}">
   <ds:schemaRefs>
     <ds:schemaRef ds:uri="http://schemas.openxmlformats.org/officeDocument/2006/bibliography"/>
   </ds:schemaRefs>

</xml_diff>

<commit_message>
Progress 19 Agustus 2026 2:34
</commit_message>
<xml_diff>
--- a/Draft Laporan Tugas Akhir/Draft TA Skripsi - 202210370311094 - M. Heykal Dhafariel Rajendra.docx
+++ b/Draft Laporan Tugas Akhir/Draft TA Skripsi - 202210370311094 - M. Heykal Dhafariel Rajendra.docx
@@ -11415,7 +11415,7 @@
         <w:t>Bagaimana proses pe</w:t>
       </w:r>
       <w:r>
-        <w:t>rancangan</w:t>
+        <w:t>mbuatan</w:t>
       </w:r>
       <w:r>
         <w:t xml:space="preserve"> sistem pengecekan stok dan pengadaan material yang sesuai dengan kebutuhan operasional King Aluminium Malang?</w:t>
@@ -11500,7 +11500,12 @@
         <w:ind w:left="567" w:hanging="425"/>
       </w:pPr>
       <w:r>
-        <w:t>Untuk merancang sistem pengecekan stok dan pengadaan material yang sesuai dengan kebutuhan operasional King Aluminium Malang.</w:t>
+        <w:t xml:space="preserve">Untuk merancang </w:t>
+      </w:r>
+      <w:bookmarkStart w:id="16" w:name="_GoBack"/>
+      <w:bookmarkEnd w:id="16"/>
+      <w:r>
+        <w:t>sistem pengecekan stok dan pengadaan material yang sesuai dengan kebutuhan operasional King Aluminium Malang.</w:t>
       </w:r>
     </w:p>
     <w:p>
@@ -11556,11 +11561,11 @@
         <w:spacing w:line="360" w:lineRule="auto"/>
         <w:ind w:left="567" w:hanging="283"/>
       </w:pPr>
-      <w:bookmarkStart w:id="16" w:name="_Toc236773767"/>
+      <w:bookmarkStart w:id="17" w:name="_Toc236773767"/>
       <w:r>
         <w:t>Batasan Penelitian</w:t>
       </w:r>
-      <w:bookmarkEnd w:id="16"/>
+      <w:bookmarkEnd w:id="17"/>
     </w:p>
     <w:p>
       <w:pPr>
@@ -11755,12 +11760,12 @@
       <w:pPr>
         <w:pStyle w:val="Heading1"/>
       </w:pPr>
-      <w:bookmarkStart w:id="17" w:name="_Toc236773768"/>
+      <w:bookmarkStart w:id="18" w:name="_Toc236773768"/>
       <w:r>
         <w:lastRenderedPageBreak/>
         <w:t>BAB II TINJAUAN PUSTAKA</w:t>
       </w:r>
-      <w:bookmarkEnd w:id="17"/>
+      <w:bookmarkEnd w:id="18"/>
     </w:p>
     <w:p>
       <w:pPr>
@@ -11775,14 +11780,14 @@
           <w:lang w:val="en-US"/>
         </w:rPr>
       </w:pPr>
-      <w:bookmarkStart w:id="18" w:name="_Toc236773769"/>
+      <w:bookmarkStart w:id="19" w:name="_Toc236773769"/>
       <w:r>
         <w:rPr>
           <w:lang w:val="en-US"/>
         </w:rPr>
         <w:t>Tinjauan Pustaka</w:t>
       </w:r>
-      <w:bookmarkEnd w:id="18"/>
+      <w:bookmarkEnd w:id="19"/>
     </w:p>
     <w:p>
       <w:pPr>
@@ -11863,7 +11868,7 @@
           <w:szCs w:val="24"/>
         </w:rPr>
       </w:pPr>
-      <w:bookmarkStart w:id="19" w:name="_Toc236356611"/>
+      <w:bookmarkStart w:id="20" w:name="_Toc236356611"/>
       <w:r>
         <w:rPr>
           <w:b/>
@@ -11935,7 +11940,7 @@
         </w:rPr>
         <w:t xml:space="preserve"> Tinjauan Penelitian Terdahulu</w:t>
       </w:r>
-      <w:bookmarkEnd w:id="19"/>
+      <w:bookmarkEnd w:id="20"/>
     </w:p>
     <w:tbl>
       <w:tblPr>
@@ -13233,14 +13238,14 @@
           <w:lang w:val="en-US"/>
         </w:rPr>
       </w:pPr>
-      <w:bookmarkStart w:id="20" w:name="_Toc236773770"/>
+      <w:bookmarkStart w:id="21" w:name="_Toc236773770"/>
       <w:r>
         <w:rPr>
           <w:lang w:val="en-US"/>
         </w:rPr>
         <w:t>Landasan Teori</w:t>
       </w:r>
-      <w:bookmarkEnd w:id="20"/>
+      <w:bookmarkEnd w:id="21"/>
     </w:p>
     <w:p>
       <w:pPr>
@@ -13252,11 +13257,11 @@
         <w:spacing w:line="360" w:lineRule="auto"/>
         <w:ind w:left="567" w:hanging="567"/>
       </w:pPr>
-      <w:bookmarkStart w:id="21" w:name="_Toc236773771"/>
+      <w:bookmarkStart w:id="22" w:name="_Toc236773771"/>
       <w:r>
         <w:t>Manajemen Stok dan Pengadaan Material</w:t>
       </w:r>
-      <w:bookmarkEnd w:id="21"/>
+      <w:bookmarkEnd w:id="22"/>
     </w:p>
     <w:p>
       <w:pPr>
@@ -13286,14 +13291,14 @@
         <w:spacing w:line="360" w:lineRule="auto"/>
         <w:ind w:left="567" w:hanging="567"/>
       </w:pPr>
-      <w:bookmarkStart w:id="22" w:name="_Toc236773772"/>
+      <w:bookmarkStart w:id="23" w:name="_Toc236773772"/>
       <w:r>
         <w:t>Business Process Model and Notation</w:t>
       </w:r>
       <w:r>
         <w:t xml:space="preserve"> (BPMN)</w:t>
       </w:r>
-      <w:bookmarkEnd w:id="22"/>
+      <w:bookmarkEnd w:id="23"/>
     </w:p>
     <w:p>
       <w:pPr>
@@ -13417,7 +13422,7 @@
           <w:szCs w:val="24"/>
         </w:rPr>
       </w:pPr>
-      <w:bookmarkStart w:id="23" w:name="_Toc236356536"/>
+      <w:bookmarkStart w:id="24" w:name="_Toc236356536"/>
       <w:r>
         <w:rPr>
           <w:b/>
@@ -13517,7 +13522,7 @@
         </w:rPr>
         <w:t>As-Is</w:t>
       </w:r>
-      <w:bookmarkEnd w:id="23"/>
+      <w:bookmarkEnd w:id="24"/>
       <w:r>
         <w:rPr>
           <w:b/>
@@ -13647,7 +13652,7 @@
         <w:spacing w:line="360" w:lineRule="auto"/>
         <w:ind w:left="567" w:hanging="567"/>
       </w:pPr>
-      <w:bookmarkStart w:id="24" w:name="_Toc236773773"/>
+      <w:bookmarkStart w:id="25" w:name="_Toc236773773"/>
       <w:r>
         <w:lastRenderedPageBreak/>
         <w:t xml:space="preserve">Metode </w:t>
@@ -13658,7 +13663,7 @@
         </w:rPr>
         <w:t>Personal Extreme Programming (PXP)</w:t>
       </w:r>
-      <w:bookmarkEnd w:id="24"/>
+      <w:bookmarkEnd w:id="25"/>
     </w:p>
     <w:p>
       <w:pPr>
@@ -14062,7 +14067,7 @@
           <w:i/>
         </w:rPr>
       </w:pPr>
-      <w:bookmarkStart w:id="25" w:name="_Toc236773774"/>
+      <w:bookmarkStart w:id="26" w:name="_Toc236773774"/>
       <w:r>
         <w:rPr>
           <w:i/>
@@ -14070,7 +14075,7 @@
         <w:lastRenderedPageBreak/>
         <w:t>Unified Modeling Language (UML)</w:t>
       </w:r>
-      <w:bookmarkEnd w:id="25"/>
+      <w:bookmarkEnd w:id="26"/>
     </w:p>
     <w:p>
       <w:pPr>
@@ -14176,7 +14181,7 @@
           <w:i/>
         </w:rPr>
       </w:pPr>
-      <w:bookmarkStart w:id="26" w:name="_Toc236773775"/>
+      <w:bookmarkStart w:id="27" w:name="_Toc236773775"/>
       <w:r>
         <w:t xml:space="preserve">Pengujian Kuantitatif dan </w:t>
       </w:r>
@@ -14186,7 +14191,7 @@
         </w:rPr>
         <w:t>User Acceptance Test (UAT)</w:t>
       </w:r>
-      <w:bookmarkEnd w:id="26"/>
+      <w:bookmarkEnd w:id="27"/>
     </w:p>
     <w:p>
       <w:pPr>
@@ -14359,7 +14364,7 @@
                 <w:iCs/>
               </w:rPr>
             </w:pPr>
-            <w:bookmarkStart w:id="27" w:name="_Toc236261898"/>
+            <w:bookmarkStart w:id="28" w:name="_Toc236261898"/>
             <w:r>
               <w:rPr>
                 <w:b/>
@@ -14408,7 +14413,7 @@
               </w:rPr>
               <w:t>)</w:t>
             </w:r>
-            <w:bookmarkEnd w:id="27"/>
+            <w:bookmarkEnd w:id="28"/>
           </w:p>
         </w:tc>
       </w:tr>
@@ -14496,12 +14501,12 @@
       <w:pPr>
         <w:pStyle w:val="Heading1"/>
       </w:pPr>
-      <w:bookmarkStart w:id="28" w:name="_Toc236773776"/>
+      <w:bookmarkStart w:id="29" w:name="_Toc236773776"/>
       <w:r>
         <w:lastRenderedPageBreak/>
         <w:t>BAB III METODOLOGI PENELITIAN</w:t>
       </w:r>
-      <w:bookmarkEnd w:id="28"/>
+      <w:bookmarkEnd w:id="29"/>
     </w:p>
     <w:p>
       <w:pPr>
@@ -14525,7 +14530,7 @@
           <w:szCs w:val="24"/>
         </w:rPr>
       </w:pPr>
-      <w:bookmarkStart w:id="29" w:name="_Toc236358137"/>
+      <w:bookmarkStart w:id="30" w:name="_Toc236358137"/>
       <w:r>
         <w:rPr>
           <w:b/>
@@ -14617,7 +14622,7 @@
         </w:rPr>
         <w:t xml:space="preserve"> Penelitian</w:t>
       </w:r>
-      <w:bookmarkEnd w:id="29"/>
+      <w:bookmarkEnd w:id="30"/>
     </w:p>
     <w:p>
       <w:pPr>
@@ -14632,14 +14637,14 @@
           <w:lang w:val="en-US"/>
         </w:rPr>
       </w:pPr>
-      <w:bookmarkStart w:id="30" w:name="_Toc236773777"/>
+      <w:bookmarkStart w:id="31" w:name="_Toc236773777"/>
       <w:r>
         <w:rPr>
           <w:lang w:val="en-US"/>
         </w:rPr>
         <w:t>Identifikasi Masalah</w:t>
       </w:r>
-      <w:bookmarkEnd w:id="30"/>
+      <w:bookmarkEnd w:id="31"/>
     </w:p>
     <w:p>
       <w:pPr>
@@ -14884,14 +14889,14 @@
           <w:lang w:val="en-US"/>
         </w:rPr>
       </w:pPr>
-      <w:bookmarkStart w:id="31" w:name="_Toc236773778"/>
+      <w:bookmarkStart w:id="32" w:name="_Toc236773778"/>
       <w:r>
         <w:rPr>
           <w:lang w:val="en-US"/>
         </w:rPr>
         <w:t>Metode Pengumpulan Data</w:t>
       </w:r>
-      <w:bookmarkEnd w:id="31"/>
+      <w:bookmarkEnd w:id="32"/>
     </w:p>
     <w:p>
       <w:pPr>
@@ -15133,7 +15138,7 @@
           <w:lang w:val="en-US"/>
         </w:rPr>
       </w:pPr>
-      <w:bookmarkStart w:id="32" w:name="_Toc236773779"/>
+      <w:bookmarkStart w:id="33" w:name="_Toc236773779"/>
       <w:r>
         <w:rPr>
           <w:lang w:val="en-US"/>
@@ -15147,7 +15152,7 @@
         </w:rPr>
         <w:t>Kebutuhan Sistem</w:t>
       </w:r>
-      <w:bookmarkEnd w:id="32"/>
+      <w:bookmarkEnd w:id="33"/>
     </w:p>
     <w:p>
       <w:pPr>
@@ -15322,7 +15327,7 @@
           <w:szCs w:val="24"/>
         </w:rPr>
       </w:pPr>
-      <w:bookmarkStart w:id="33" w:name="_Toc236608700"/>
+      <w:bookmarkStart w:id="34" w:name="_Toc236608700"/>
       <w:r>
         <w:rPr>
           <w:b/>
@@ -15394,7 +15399,7 @@
         </w:rPr>
         <w:t xml:space="preserve"> Aspek Proses Observasi</w:t>
       </w:r>
-      <w:bookmarkEnd w:id="33"/>
+      <w:bookmarkEnd w:id="34"/>
     </w:p>
     <w:tbl>
       <w:tblPr>
@@ -17115,14 +17120,14 @@
           <w:lang w:val="en-US"/>
         </w:rPr>
       </w:pPr>
-      <w:bookmarkStart w:id="34" w:name="_Toc236773780"/>
+      <w:bookmarkStart w:id="35" w:name="_Toc236773780"/>
       <w:r>
         <w:rPr>
           <w:lang w:val="en-US"/>
         </w:rPr>
         <w:t>Metode Pengembangan Sistem</w:t>
       </w:r>
-      <w:bookmarkEnd w:id="34"/>
+      <w:bookmarkEnd w:id="35"/>
     </w:p>
     <w:p>
       <w:pPr>
@@ -17196,7 +17201,7 @@
           <w:szCs w:val="24"/>
         </w:rPr>
       </w:pPr>
-      <w:bookmarkStart w:id="35" w:name="_Toc236358138"/>
+      <w:bookmarkStart w:id="36" w:name="_Toc236358138"/>
       <w:r>
         <w:rPr>
           <w:b/>
@@ -17277,7 +17282,7 @@
         </w:rPr>
         <w:t>PXP</w:t>
       </w:r>
-      <w:bookmarkEnd w:id="35"/>
+      <w:bookmarkEnd w:id="36"/>
     </w:p>
     <w:p>
       <w:pPr>
@@ -17353,7 +17358,7 @@
         <w:spacing w:line="360" w:lineRule="auto"/>
         <w:ind w:left="567" w:hanging="567"/>
       </w:pPr>
-      <w:bookmarkStart w:id="36" w:name="_Toc236773781"/>
+      <w:bookmarkStart w:id="37" w:name="_Toc236773781"/>
       <w:r>
         <w:rPr>
           <w:i/>
@@ -17363,7 +17368,7 @@
       <w:r>
         <w:t>s</w:t>
       </w:r>
-      <w:bookmarkEnd w:id="36"/>
+      <w:bookmarkEnd w:id="37"/>
     </w:p>
     <w:p>
       <w:pPr>
@@ -17469,14 +17474,14 @@
           <w:i/>
         </w:rPr>
       </w:pPr>
-      <w:bookmarkStart w:id="37" w:name="_Toc236773782"/>
+      <w:bookmarkStart w:id="38" w:name="_Toc236773782"/>
       <w:r>
         <w:rPr>
           <w:i/>
         </w:rPr>
         <w:t>Planning</w:t>
       </w:r>
-      <w:bookmarkEnd w:id="37"/>
+      <w:bookmarkEnd w:id="38"/>
     </w:p>
     <w:p>
       <w:pPr>
@@ -17678,14 +17683,14 @@
           <w:i/>
         </w:rPr>
       </w:pPr>
-      <w:bookmarkStart w:id="38" w:name="_Toc236773783"/>
+      <w:bookmarkStart w:id="39" w:name="_Toc236773783"/>
       <w:r>
         <w:rPr>
           <w:i/>
         </w:rPr>
         <w:t>Iteration Initialization</w:t>
       </w:r>
-      <w:bookmarkEnd w:id="38"/>
+      <w:bookmarkEnd w:id="39"/>
     </w:p>
     <w:p>
       <w:pPr>
@@ -17948,14 +17953,14 @@
           <w:i/>
         </w:rPr>
       </w:pPr>
-      <w:bookmarkStart w:id="39" w:name="_Toc236773784"/>
+      <w:bookmarkStart w:id="40" w:name="_Toc236773784"/>
       <w:r>
         <w:rPr>
           <w:i/>
         </w:rPr>
         <w:t>Design</w:t>
       </w:r>
-      <w:bookmarkEnd w:id="39"/>
+      <w:bookmarkEnd w:id="40"/>
     </w:p>
     <w:p>
       <w:pPr>
@@ -18042,14 +18047,14 @@
           <w:i/>
         </w:rPr>
       </w:pPr>
-      <w:bookmarkStart w:id="40" w:name="_Toc236773785"/>
+      <w:bookmarkStart w:id="41" w:name="_Toc236773785"/>
       <w:r>
         <w:rPr>
           <w:i/>
         </w:rPr>
         <w:t>Implementation</w:t>
       </w:r>
-      <w:bookmarkEnd w:id="40"/>
+      <w:bookmarkEnd w:id="41"/>
     </w:p>
     <w:p>
       <w:pPr>
@@ -18162,14 +18167,14 @@
           <w:i/>
         </w:rPr>
       </w:pPr>
-      <w:bookmarkStart w:id="41" w:name="_Toc236773786"/>
+      <w:bookmarkStart w:id="42" w:name="_Toc236773786"/>
       <w:r>
         <w:rPr>
           <w:i/>
         </w:rPr>
         <w:t>System Testing</w:t>
       </w:r>
-      <w:bookmarkEnd w:id="41"/>
+      <w:bookmarkEnd w:id="42"/>
     </w:p>
     <w:p>
       <w:pPr>
@@ -18359,7 +18364,7 @@
           <w:szCs w:val="24"/>
         </w:rPr>
       </w:pPr>
-      <w:bookmarkStart w:id="42" w:name="_Toc236608701"/>
+      <w:bookmarkStart w:id="43" w:name="_Toc236608701"/>
       <w:r>
         <w:rPr>
           <w:b/>
@@ -18440,7 +18445,7 @@
         </w:rPr>
         <w:t>Usability Testing</w:t>
       </w:r>
-      <w:bookmarkEnd w:id="42"/>
+      <w:bookmarkEnd w:id="43"/>
     </w:p>
     <w:tbl>
       <w:tblPr>
@@ -18983,7 +18988,7 @@
           <w:szCs w:val="24"/>
         </w:rPr>
       </w:pPr>
-      <w:bookmarkStart w:id="43" w:name="_Toc236608702"/>
+      <w:bookmarkStart w:id="44" w:name="_Toc236608702"/>
       <w:r>
         <w:rPr>
           <w:b/>
@@ -19055,7 +19060,7 @@
         </w:rPr>
         <w:t xml:space="preserve"> Skala Penilaian Kuisioner</w:t>
       </w:r>
-      <w:bookmarkEnd w:id="43"/>
+      <w:bookmarkEnd w:id="44"/>
     </w:p>
     <w:tbl>
       <w:tblPr>
@@ -19293,7 +19298,7 @@
           <w:szCs w:val="24"/>
         </w:rPr>
       </w:pPr>
-      <w:bookmarkStart w:id="44" w:name="_Toc236608703"/>
+      <w:bookmarkStart w:id="45" w:name="_Toc236608703"/>
       <w:r>
         <w:rPr>
           <w:b/>
@@ -19374,7 +19379,7 @@
         </w:rPr>
         <w:t>User Acceptance Test (UAT)</w:t>
       </w:r>
-      <w:bookmarkEnd w:id="44"/>
+      <w:bookmarkEnd w:id="45"/>
     </w:p>
     <w:tbl>
       <w:tblPr>
@@ -19625,8 +19630,6 @@
               <w:spacing w:line="360" w:lineRule="auto"/>
               <w:jc w:val="center"/>
             </w:pPr>
-            <w:bookmarkStart w:id="45" w:name="_GoBack"/>
-            <w:bookmarkEnd w:id="45"/>
             <w:r>
               <w:t>P6</w:t>
             </w:r>
@@ -34878,13 +34881,7 @@
         <w:ind w:firstLine="567"/>
       </w:pPr>
       <w:r>
-        <w:t>Halaman Material Masuk</w:t>
-      </w:r>
-      <w:r>
-        <w:t xml:space="preserve"> pada Gambar 4.9</w:t>
-      </w:r>
-      <w:r>
-        <w:t xml:space="preserve"> dirancang untuk menggambarkan proses pencatatan transaksi material yang masuk ke dalam persediaan. Halaman ini menyediakan form untuk memilih nama material, jenis material, jenis transaksi, jumlah material, tanggal transaksi, serta tujuan/keterangan sebagai informasi pendukung transaksi.</w:t>
+        <w:t>Halaman Material Masuk pada Gambar 4.9 dirancang untuk menggambarkan proses pencatatan transaksi material yang masuk ke dalam persediaan. Halaman ini menyediakan form untuk memilih nama material, jenis material, jenis transaksi, jumlah material, tanggal transaksi, serta tujuan/keterangan sebagai informasi pendukung transaksi.</w:t>
       </w:r>
     </w:p>
     <w:p>
@@ -35585,13 +35582,7 @@
         <w:ind w:firstLine="567"/>
       </w:pPr>
       <w:r>
-        <w:t>Halaman Ajukan Pengadaan</w:t>
-      </w:r>
-      <w:r>
-        <w:t xml:space="preserve"> pada Gambar 4.13</w:t>
-      </w:r>
-      <w:r>
-        <w:t xml:space="preserve"> dirancang untuk menggambarkan proses pengajuan kebutuhan material ketika stok berada pada kondisi menipis atau habis. Halaman ini menyediakan form untuk menentukan nama material, jumlah material yang akan dipesan, supplier, tanggal pemesanan, dan estimasi kedatangan.</w:t>
+        <w:t>Halaman Ajukan Pengadaan pada Gambar 4.13 dirancang untuk menggambarkan proses pengajuan kebutuhan material ketika stok berada pada kondisi menipis atau habis. Halaman ini menyediakan form untuk menentukan nama material, jumlah material yang akan dipesan, supplier, tanggal pemesanan, dan estimasi kedatangan.</w:t>
       </w:r>
     </w:p>
     <w:p>
@@ -35762,13 +35753,7 @@
         <w:ind w:firstLine="567"/>
       </w:pPr>
       <w:r>
-        <w:t>Halaman Persetujuan Pengadaan</w:t>
-      </w:r>
-      <w:r>
-        <w:t xml:space="preserve"> pada Gambar 4.14</w:t>
-      </w:r>
-      <w:r>
-        <w:t xml:space="preserve"> dirancang untuk menggambarkan proses peninjauan dan pemberian keputusan terhadap pengajuan pengadaan material. Halaman ini menyediakan ringkasan jumlah pengajuan berdasarkan status, yaitu total pengajuan, menunggu, disetujui, dan ditolak.</w:t>
+        <w:t>Halaman Persetujuan Pengadaan pada Gambar 4.14 dirancang untuk menggambarkan proses peninjauan dan pemberian keputusan terhadap pengajuan pengadaan material. Halaman ini menyediakan ringkasan jumlah pengajuan berdasarkan status, yaitu total pengajuan, menunggu, disetujui, dan ditolak.</w:t>
       </w:r>
     </w:p>
     <w:p>
@@ -35948,13 +35933,7 @@
         <w:ind w:firstLine="567"/>
       </w:pPr>
       <w:r>
-        <w:t xml:space="preserve">Halaman Riwayat Transaksi </w:t>
-      </w:r>
-      <w:r>
-        <w:t xml:space="preserve">pada Gambar 4.15 </w:t>
-      </w:r>
-      <w:r>
-        <w:t>dirancang untuk menampilkan dan memantau seluruh aktivitas transaksi yang berkaitan dengan pengadaan, penerimaan material, dan pengeluaran stok. Halaman ini menyediakan ringkasan berupa jumlah total transaksi, pengadaan, penerimaan material, dan pengeluaran stok.</w:t>
+        <w:t>Halaman Riwayat Transaksi pada Gambar 4.15 dirancang untuk menampilkan dan memantau seluruh aktivitas transaksi yang berkaitan dengan pengadaan, penerimaan material, dan pengeluaran stok. Halaman ini menyediakan ringkasan berupa jumlah total transaksi, pengadaan, penerimaan material, dan pengeluaran stok.</w:t>
       </w:r>
     </w:p>
     <w:p>
@@ -43064,7 +43043,7 @@
 </file>
 
 <file path=customXml/itemProps1.xml><?xml version="1.0" encoding="utf-8"?>
-<ds:datastoreItem xmlns:ds="http://schemas.openxmlformats.org/officeDocument/2006/customXml" ds:itemID="{B0706721-D702-4E0D-A4D2-DA6808B61176}">
+<ds:datastoreItem xmlns:ds="http://schemas.openxmlformats.org/officeDocument/2006/customXml" ds:itemID="{6287CFAA-27B5-4904-8222-16E479076027}">
   <ds:schemaRefs>
     <ds:schemaRef ds:uri="http://schemas.openxmlformats.org/officeDocument/2006/bibliography"/>
   </ds:schemaRefs>

</xml_diff>